<commit_message>
Fix formatting of the routines plan document
Co-Authored-By: Claude Sonnet 5 <noreply@anthropic.com>
</commit_message>
<xml_diff>
--- a/ROUTINES-PLAN.docx
+++ b/ROUTINES-PLAN.docx
@@ -3,22 +3,16 @@
 <w:document xmlns:wpc="http://schemas.microsoft.com/office/word/2010/wordprocessingCanvas" xmlns:mo="http://schemas.microsoft.com/office/mac/office/2008/main" xmlns:mc="http://schemas.openxmlformats.org/markup-compatibility/2006" xmlns:mv="urn:schemas-microsoft-com:mac:vml" xmlns:o="urn:schemas-microsoft-com:office:office" xmlns:r="http://schemas.openxmlformats.org/officeDocument/2006/relationships" xmlns:m="http://schemas.openxmlformats.org/officeDocument/2006/math" xmlns:v="urn:schemas-microsoft-com:vml" xmlns:wp14="http://schemas.microsoft.com/office/word/2010/wordprocessingDrawing" xmlns:wp="http://schemas.openxmlformats.org/drawingml/2006/wordprocessingDrawing" xmlns:w10="urn:schemas-microsoft-com:office:word" xmlns:w="http://schemas.openxmlformats.org/wordprocessingml/2006/main" xmlns:w14="http://schemas.microsoft.com/office/word/2010/wordml" xmlns:wpg="http://schemas.microsoft.com/office/word/2010/wordprocessingGroup" xmlns:wpi="http://schemas.microsoft.com/office/word/2010/wordprocessingInk" xmlns:wne="http://schemas.microsoft.com/office/word/2006/wordml" xmlns:wps="http://schemas.microsoft.com/office/word/2010/wordprocessingShape" mc:Ignorable="w14 wp14">
   <w:body>
     <w:p>
+      <w:pPr>
+        <w:pStyle w:val="Title"/>
+      </w:pPr>
       <w:r>
-        <w:t>`# Routines plan: rewrite the existing routines, add the missing ones</w:t>
+        <w:t>Routines plan: rewrite the existing routines, add the missing ones</w:t>
       </w:r>
     </w:p>
     <w:p>
       <w:r>
-        <w:rPr>
-          <w:rFonts w:ascii="Consolas" w:hAnsi="Consolas"/>
-          <w:color w:val="1F4E8C"/>
-          <w:sz w:val="19"/>
-        </w:rPr>
-      </w:r>
-    </w:p>
-    <w:p>
-      <w:r>
-        <w:t xml:space="preserve">`Status as of 21 September 2026. Scope: TheCapeTownHub, PretoriaHub and PolokwaneHub. </w:t>
+        <w:t xml:space="preserve">Status as of 21 September 2026. Scope: TheCapeTownHub, PretoriaHub and PolokwaneHub. </w:t>
       </w:r>
       <w:r>
         <w:rPr>
@@ -41,62 +35,521 @@
     </w:p>
     <w:p>
       <w:r>
-        <w:rPr>
-          <w:rFonts w:ascii="Consolas" w:hAnsi="Consolas"/>
-          <w:color w:val="1F4E8C"/>
-          <w:sz w:val="19"/>
-        </w:rPr>
+        <w:t>The aim: every routine does only the work that is needed, uses as little of the AI agent (and as few database reads) as possible, and tells you when it fails.</w:t>
       </w:r>
     </w:p>
     <w:p>
+      <w:pPr>
+        <w:pStyle w:val="Heading1"/>
+      </w:pPr>
       <w:r>
-        <w:t>`The aim: every routine does only the work that is needed, uses as little of the AI agent (and as few database reads) as possible, and tells you when it fails.</w:t>
+        <w:t>1. What exists today</w:t>
       </w:r>
     </w:p>
+    <w:tbl>
+      <w:tblPr>
+        <w:tblStyle w:val="TableGrid"/>
+        <w:tblW w:type="auto" w:w="0"/>
+        <w:tblLook w:firstColumn="1" w:firstRow="1" w:lastColumn="0" w:lastRow="0" w:noHBand="0" w:noVBand="1" w:val="04A0"/>
+      </w:tblPr>
+      <w:tblGrid>
+        <w:gridCol w:w="2493"/>
+        <w:gridCol w:w="2493"/>
+        <w:gridCol w:w="2493"/>
+        <w:gridCol w:w="2493"/>
+      </w:tblGrid>
+      <w:tr>
+        <w:tc>
+          <w:tcPr>
+            <w:tcW w:type="dxa" w:w="2493"/>
+            <w:shd w:val="clear" w:color="auto" w:fill="0A2540"/>
+          </w:tcPr>
+          <w:p>
+            <w:r>
+              <w:rPr>
+                <w:b/>
+                <w:color w:val="FFFFFF"/>
+              </w:rPr>
+            </w:r>
+            <w:r>
+              <w:rPr>
+                <w:b/>
+                <w:color w:val="FFFFFF"/>
+                <w:sz w:val="19"/>
+              </w:rPr>
+              <w:t>Routine</w:t>
+            </w:r>
+          </w:p>
+        </w:tc>
+        <w:tc>
+          <w:tcPr>
+            <w:tcW w:type="dxa" w:w="2493"/>
+            <w:shd w:val="clear" w:color="auto" w:fill="0A2540"/>
+          </w:tcPr>
+          <w:p>
+            <w:r>
+              <w:rPr>
+                <w:b/>
+                <w:color w:val="FFFFFF"/>
+              </w:rPr>
+            </w:r>
+            <w:r>
+              <w:rPr>
+                <w:b/>
+                <w:color w:val="FFFFFF"/>
+                <w:sz w:val="19"/>
+              </w:rPr>
+              <w:t>Runs</w:t>
+            </w:r>
+          </w:p>
+        </w:tc>
+        <w:tc>
+          <w:tcPr>
+            <w:tcW w:type="dxa" w:w="2493"/>
+            <w:shd w:val="clear" w:color="auto" w:fill="0A2540"/>
+          </w:tcPr>
+          <w:p>
+            <w:r>
+              <w:rPr>
+                <w:b/>
+                <w:color w:val="FFFFFF"/>
+              </w:rPr>
+            </w:r>
+            <w:r>
+              <w:rPr>
+                <w:b/>
+                <w:color w:val="FFFFFF"/>
+                <w:sz w:val="19"/>
+              </w:rPr>
+              <w:t>Does what</w:t>
+            </w:r>
+          </w:p>
+        </w:tc>
+        <w:tc>
+          <w:tcPr>
+            <w:tcW w:type="dxa" w:w="2493"/>
+            <w:shd w:val="clear" w:color="auto" w:fill="0A2540"/>
+          </w:tcPr>
+          <w:p>
+            <w:r>
+              <w:rPr>
+                <w:b/>
+                <w:color w:val="FFFFFF"/>
+              </w:rPr>
+            </w:r>
+            <w:r>
+              <w:rPr>
+                <w:b/>
+                <w:color w:val="FFFFFF"/>
+                <w:sz w:val="19"/>
+              </w:rPr>
+              <w:t>Where</w:t>
+            </w:r>
+          </w:p>
+        </w:tc>
+      </w:tr>
+      <w:tr>
+        <w:tc>
+          <w:tcPr>
+            <w:tcW w:type="dxa" w:w="2493"/>
+          </w:tcPr>
+          <w:p>
+            <w:r/>
+            <w:r>
+              <w:rPr>
+                <w:b/>
+                <w:sz w:val="19"/>
+              </w:rPr>
+              <w:t>Business routine</w:t>
+            </w:r>
+            <w:r>
+              <w:rPr>
+                <w:sz w:val="19"/>
+              </w:rPr>
+              <w:t xml:space="preserve"> (one per city)</w:t>
+            </w:r>
+          </w:p>
+        </w:tc>
+        <w:tc>
+          <w:tcPr>
+            <w:tcW w:type="dxa" w:w="2493"/>
+          </w:tcPr>
+          <w:p>
+            <w:r/>
+            <w:r>
+              <w:rPr>
+                <w:sz w:val="19"/>
+              </w:rPr>
+              <w:t>Hourly cloud agent</w:t>
+            </w:r>
+          </w:p>
+        </w:tc>
+        <w:tc>
+          <w:tcPr>
+            <w:tcW w:type="dxa" w:w="2493"/>
+          </w:tcPr>
+          <w:p>
+            <w:r/>
+            <w:r>
+              <w:rPr>
+                <w:sz w:val="19"/>
+              </w:rPr>
+              <w:t xml:space="preserve">Five jobs: (1) discover new businesses, 3 suburbs per run; (2) discover shopping centres and their tenants; (3) sweep one shopping centre's own website; (4) enrich descriptions and hours of existing businesses; (5) check for permanently closed businesses. Writes a SQL file to </w:t>
+            </w:r>
+            <w:r>
+              <w:rPr>
+                <w:rFonts w:ascii="Consolas" w:hAnsi="Consolas"/>
+                <w:color w:val="1F4E8C"/>
+                <w:sz w:val="17"/>
+              </w:rPr>
+              <w:t>db/routine-updates/&lt;city&gt;/</w:t>
+            </w:r>
+            <w:r>
+              <w:rPr>
+                <w:sz w:val="19"/>
+              </w:rPr>
+              <w:t>.</w:t>
+            </w:r>
+          </w:p>
+        </w:tc>
+        <w:tc>
+          <w:tcPr>
+            <w:tcW w:type="dxa" w:w="2493"/>
+          </w:tcPr>
+          <w:p>
+            <w:r/>
+            <w:r>
+              <w:rPr>
+                <w:rFonts w:ascii="Consolas" w:hAnsi="Consolas"/>
+                <w:color w:val="1F4E8C"/>
+                <w:sz w:val="17"/>
+              </w:rPr>
+              <w:t>ROUTINE.capetown.md</w:t>
+            </w:r>
+            <w:r>
+              <w:rPr>
+                <w:sz w:val="19"/>
+              </w:rPr>
+              <w:t xml:space="preserve"> (903 lines), </w:t>
+            </w:r>
+            <w:r>
+              <w:rPr>
+                <w:rFonts w:ascii="Consolas" w:hAnsi="Consolas"/>
+                <w:color w:val="1F4E8C"/>
+                <w:sz w:val="17"/>
+              </w:rPr>
+              <w:t>ROUTINE.pretoria.md</w:t>
+            </w:r>
+            <w:r>
+              <w:rPr>
+                <w:sz w:val="19"/>
+              </w:rPr>
+              <w:t xml:space="preserve"> (720), </w:t>
+            </w:r>
+            <w:r>
+              <w:rPr>
+                <w:rFonts w:ascii="Consolas" w:hAnsi="Consolas"/>
+                <w:color w:val="1F4E8C"/>
+                <w:sz w:val="17"/>
+              </w:rPr>
+              <w:t>ROUTINE.polokwane.md</w:t>
+            </w:r>
+            <w:r>
+              <w:rPr>
+                <w:sz w:val="19"/>
+              </w:rPr>
+              <w:t xml:space="preserve"> (922)</w:t>
+            </w:r>
+          </w:p>
+        </w:tc>
+      </w:tr>
+      <w:tr>
+        <w:tc>
+          <w:tcPr>
+            <w:tcW w:type="dxa" w:w="2493"/>
+          </w:tcPr>
+          <w:p>
+            <w:r/>
+            <w:r>
+              <w:rPr>
+                <w:b/>
+                <w:sz w:val="19"/>
+              </w:rPr>
+              <w:t>Events routine</w:t>
+            </w:r>
+            <w:r>
+              <w:rPr>
+                <w:sz w:val="19"/>
+              </w:rPr>
+              <w:t xml:space="preserve"> (one per city)</w:t>
+            </w:r>
+          </w:p>
+        </w:tc>
+        <w:tc>
+          <w:tcPr>
+            <w:tcW w:type="dxa" w:w="2493"/>
+          </w:tcPr>
+          <w:p>
+            <w:r/>
+            <w:r>
+              <w:rPr>
+                <w:sz w:val="19"/>
+              </w:rPr>
+              <w:t>Weekly cloud agent</w:t>
+            </w:r>
+          </w:p>
+        </w:tc>
+        <w:tc>
+          <w:tcPr>
+            <w:tcW w:type="dxa" w:w="2493"/>
+          </w:tcPr>
+          <w:p>
+            <w:r/>
+            <w:r>
+              <w:rPr>
+                <w:sz w:val="19"/>
+              </w:rPr>
+              <w:t>Finds upcoming public events and proposes them for the Events page.</w:t>
+            </w:r>
+          </w:p>
+        </w:tc>
+        <w:tc>
+          <w:tcPr>
+            <w:tcW w:type="dxa" w:w="2493"/>
+          </w:tcPr>
+          <w:p>
+            <w:r/>
+            <w:r>
+              <w:rPr>
+                <w:rFonts w:ascii="Consolas" w:hAnsi="Consolas"/>
+                <w:color w:val="1F4E8C"/>
+                <w:sz w:val="17"/>
+              </w:rPr>
+              <w:t>ROUTINE.events.&lt;city&gt;.md</w:t>
+            </w:r>
+            <w:r>
+              <w:rPr>
+                <w:sz w:val="19"/>
+              </w:rPr>
+              <w:t xml:space="preserve"> (144 lines each)</w:t>
+            </w:r>
+          </w:p>
+        </w:tc>
+      </w:tr>
+      <w:tr>
+        <w:tc>
+          <w:tcPr>
+            <w:tcW w:type="dxa" w:w="2493"/>
+          </w:tcPr>
+          <w:p>
+            <w:r/>
+            <w:r>
+              <w:rPr>
+                <w:b/>
+                <w:sz w:val="19"/>
+              </w:rPr>
+              <w:t>News routine</w:t>
+            </w:r>
+            <w:r>
+              <w:rPr>
+                <w:sz w:val="19"/>
+              </w:rPr>
+              <w:t xml:space="preserve"> (one per city)</w:t>
+            </w:r>
+          </w:p>
+        </w:tc>
+        <w:tc>
+          <w:tcPr>
+            <w:tcW w:type="dxa" w:w="2493"/>
+          </w:tcPr>
+          <w:p>
+            <w:r/>
+            <w:r>
+              <w:rPr>
+                <w:sz w:val="19"/>
+              </w:rPr>
+              <w:t>Daily cloud agent</w:t>
+            </w:r>
+          </w:p>
+        </w:tc>
+        <w:tc>
+          <w:tcPr>
+            <w:tcW w:type="dxa" w:w="2493"/>
+          </w:tcPr>
+          <w:p>
+            <w:r/>
+            <w:r>
+              <w:rPr>
+                <w:sz w:val="19"/>
+              </w:rPr>
+              <w:t xml:space="preserve">Writes the day's local news articles and the monthly fuel prices. Checked by </w:t>
+            </w:r>
+            <w:r>
+              <w:rPr>
+                <w:rFonts w:ascii="Consolas" w:hAnsi="Consolas"/>
+                <w:color w:val="1F4E8C"/>
+                <w:sz w:val="17"/>
+              </w:rPr>
+              <w:t>npm run check:news</w:t>
+            </w:r>
+            <w:r>
+              <w:rPr>
+                <w:sz w:val="19"/>
+              </w:rPr>
+              <w:t xml:space="preserve"> before pushing.</w:t>
+            </w:r>
+          </w:p>
+        </w:tc>
+        <w:tc>
+          <w:tcPr>
+            <w:tcW w:type="dxa" w:w="2493"/>
+          </w:tcPr>
+          <w:p>
+            <w:r/>
+            <w:r>
+              <w:rPr>
+                <w:rFonts w:ascii="Consolas" w:hAnsi="Consolas"/>
+                <w:color w:val="1F4E8C"/>
+                <w:sz w:val="17"/>
+              </w:rPr>
+              <w:t>ROUTINE.news.&lt;city&gt;.md</w:t>
+            </w:r>
+            <w:r>
+              <w:rPr>
+                <w:sz w:val="19"/>
+              </w:rPr>
+              <w:t xml:space="preserve"> (174 lines each)</w:t>
+            </w:r>
+          </w:p>
+        </w:tc>
+      </w:tr>
+      <w:tr>
+        <w:tc>
+          <w:tcPr>
+            <w:tcW w:type="dxa" w:w="2493"/>
+          </w:tcPr>
+          <w:p>
+            <w:r/>
+            <w:r>
+              <w:rPr>
+                <w:b/>
+                <w:sz w:val="19"/>
+              </w:rPr>
+              <w:t>Owner reminders</w:t>
+            </w:r>
+          </w:p>
+        </w:tc>
+        <w:tc>
+          <w:tcPr>
+            <w:tcW w:type="dxa" w:w="2493"/>
+          </w:tcPr>
+          <w:p>
+            <w:r/>
+            <w:r>
+              <w:rPr>
+                <w:sz w:val="19"/>
+              </w:rPr>
+              <w:t>Daily 07:00 UTC, GitHub Actions</w:t>
+            </w:r>
+          </w:p>
+        </w:tc>
+        <w:tc>
+          <w:tcPr>
+            <w:tcW w:type="dxa" w:w="2493"/>
+          </w:tcPr>
+          <w:p>
+            <w:r/>
+            <w:r>
+              <w:rPr>
+                <w:sz w:val="19"/>
+              </w:rPr>
+              <w:t>Emails owners whose listing confirmation is outstanding.</w:t>
+            </w:r>
+          </w:p>
+        </w:tc>
+        <w:tc>
+          <w:tcPr>
+            <w:tcW w:type="dxa" w:w="2493"/>
+          </w:tcPr>
+          <w:p>
+            <w:r/>
+            <w:r>
+              <w:rPr>
+                <w:rFonts w:ascii="Consolas" w:hAnsi="Consolas"/>
+                <w:color w:val="1F4E8C"/>
+                <w:sz w:val="17"/>
+              </w:rPr>
+              <w:t>.github/workflows/owner-reminders.yml</w:t>
+            </w:r>
+          </w:p>
+        </w:tc>
+      </w:tr>
+      <w:tr>
+        <w:tc>
+          <w:tcPr>
+            <w:tcW w:type="dxa" w:w="2493"/>
+          </w:tcPr>
+          <w:p>
+            <w:r/>
+            <w:r>
+              <w:rPr>
+                <w:b/>
+                <w:sz w:val="19"/>
+              </w:rPr>
+              <w:t>Subscription expiry</w:t>
+            </w:r>
+          </w:p>
+        </w:tc>
+        <w:tc>
+          <w:tcPr>
+            <w:tcW w:type="dxa" w:w="2493"/>
+          </w:tcPr>
+          <w:p>
+            <w:r/>
+            <w:r>
+              <w:rPr>
+                <w:sz w:val="19"/>
+              </w:rPr>
+              <w:t>Daily 07:15 UTC, GitHub Actions</w:t>
+            </w:r>
+          </w:p>
+        </w:tc>
+        <w:tc>
+          <w:tcPr>
+            <w:tcW w:type="dxa" w:w="2493"/>
+          </w:tcPr>
+          <w:p>
+            <w:r/>
+            <w:r>
+              <w:rPr>
+                <w:sz w:val="19"/>
+              </w:rPr>
+              <w:t>Expires paid plans and sponsorships that have lapsed.</w:t>
+            </w:r>
+          </w:p>
+        </w:tc>
+        <w:tc>
+          <w:tcPr>
+            <w:tcW w:type="dxa" w:w="2493"/>
+          </w:tcPr>
+          <w:p>
+            <w:r/>
+            <w:r>
+              <w:rPr>
+                <w:rFonts w:ascii="Consolas" w:hAnsi="Consolas"/>
+                <w:color w:val="1F4E8C"/>
+                <w:sz w:val="17"/>
+              </w:rPr>
+              <w:t>.github/workflows/subscription-expiry.yml</w:t>
+            </w:r>
+          </w:p>
+        </w:tc>
+      </w:tr>
+    </w:tbl>
+    <w:p/>
     <w:p>
       <w:r>
-        <w:rPr>
-          <w:rFonts w:ascii="Consolas" w:hAnsi="Consolas"/>
-          <w:color w:val="1F4E8C"/>
-          <w:sz w:val="19"/>
-        </w:rPr>
-      </w:r>
-    </w:p>
-    <w:p>
-      <w:r>
-        <w:t>`## 1. What exists today</w:t>
-      </w:r>
-    </w:p>
-    <w:p>
-      <w:r>
-        <w:rPr>
-          <w:rFonts w:ascii="Consolas" w:hAnsi="Consolas"/>
-          <w:color w:val="1F4E8C"/>
-          <w:sz w:val="19"/>
-        </w:rPr>
-      </w:r>
-    </w:p>
-    <w:p>
-      <w:r>
-        <w:t>`| Routine | Runs | Does what | Where |</w:t>
-      </w:r>
-    </w:p>
-    <w:p>
-      <w:r>
-        <w:t>`|---|---|---|---|</w:t>
-      </w:r>
-    </w:p>
-    <w:p>
-      <w:r>
-        <w:rPr>
-          <w:rFonts w:ascii="Consolas" w:hAnsi="Consolas"/>
-          <w:color w:val="1F4E8C"/>
-          <w:sz w:val="19"/>
-        </w:rPr>
-        <w:t>| **Business routine** (one per city) | Hourly cloud agent | Five jobs: (1) discover new businesses, 3 suburbs per run; (2) discover shopping centres and their tenants; (3) sweep one shopping centre's own website; (4) enrich descriptions and hours of existing businesses; (5) check for permanently closed businesses. Writes a SQL file to \</w:t>
-      </w:r>
-      <w:r>
-        <w:t>db/routine-updates/&lt;city&gt;/\</w:t>
+        <w:t xml:space="preserve">How agent output reaches the site: the agent commits a SQL file, and the deploy workflow (runs on every push to </w:t>
       </w:r>
       <w:r>
         <w:rPr>
@@ -104,10 +557,10 @@
           <w:color w:val="1F4E8C"/>
           <w:sz w:val="19"/>
         </w:rPr>
-        <w:t>. | \</w:t>
+        <w:t>main</w:t>
       </w:r>
       <w:r>
-        <w:t>ROUTINE.capetown.md\</w:t>
+        <w:t xml:space="preserve">) applies it to the live database, rebuilds the snapshot in </w:t>
       </w:r>
       <w:r>
         <w:rPr>
@@ -115,146 +568,24 @@
           <w:color w:val="1F4E8C"/>
           <w:sz w:val="19"/>
         </w:rPr>
-        <w:t xml:space="preserve"> (903 lines), \</w:t>
+        <w:t>status/&lt;city&gt;/db-snapshot.json</w:t>
       </w:r>
       <w:r>
-        <w:t>ROUTINE.pretoria.md\</w:t>
-      </w:r>
-      <w:r>
-        <w:rPr>
-          <w:rFonts w:ascii="Consolas" w:hAnsi="Consolas"/>
-          <w:color w:val="1F4E8C"/>
-          <w:sz w:val="19"/>
-        </w:rPr>
-        <w:t xml:space="preserve"> (720), \</w:t>
-      </w:r>
-      <w:r>
-        <w:t>ROUTINE.polokwane.md\` (922) |</w:t>
+        <w:t xml:space="preserve"> and redeploys all three sites.</w:t>
       </w:r>
     </w:p>
     <w:p>
+      <w:pPr>
+        <w:pStyle w:val="Heading1"/>
+      </w:pPr>
       <w:r>
-        <w:rPr>
-          <w:rFonts w:ascii="Consolas" w:hAnsi="Consolas"/>
-          <w:color w:val="1F4E8C"/>
-          <w:sz w:val="19"/>
-        </w:rPr>
-        <w:t>| **Events routine** (one per city) | Weekly cloud agent | Finds upcoming public events and proposes them for the Events page. | \</w:t>
-      </w:r>
-      <w:r>
-        <w:t>ROUTINE.events.&lt;city&gt;.md\` (144 lines each) |</w:t>
+        <w:t>2. What is inefficient today</w:t>
       </w:r>
     </w:p>
     <w:p>
-      <w:r>
-        <w:rPr>
-          <w:rFonts w:ascii="Consolas" w:hAnsi="Consolas"/>
-          <w:color w:val="1F4E8C"/>
-          <w:sz w:val="19"/>
-        </w:rPr>
-        <w:t>| **News routine** (one per city) | Daily cloud agent | Writes the day's local news articles and the monthly fuel prices. Checked by \</w:t>
-      </w:r>
-      <w:r>
-        <w:t>npm run check:news\</w:t>
-      </w:r>
-      <w:r>
-        <w:rPr>
-          <w:rFonts w:ascii="Consolas" w:hAnsi="Consolas"/>
-          <w:color w:val="1F4E8C"/>
-          <w:sz w:val="19"/>
-        </w:rPr>
-        <w:t xml:space="preserve"> before pushing. | \</w:t>
-      </w:r>
-      <w:r>
-        <w:t>ROUTINE.news.&lt;city&gt;.md\` (174 lines each) |</w:t>
-      </w:r>
-    </w:p>
-    <w:p>
-      <w:r>
-        <w:rPr>
-          <w:rFonts w:ascii="Consolas" w:hAnsi="Consolas"/>
-          <w:color w:val="1F4E8C"/>
-          <w:sz w:val="19"/>
-        </w:rPr>
-        <w:t>| **Owner reminders** | Daily 07:00 UTC, GitHub Actions | Emails owners whose listing confirmation is outstanding. | \</w:t>
-      </w:r>
-      <w:r>
-        <w:t>.github/workflows/owner-reminders.yml\` |</w:t>
-      </w:r>
-    </w:p>
-    <w:p>
-      <w:r>
-        <w:rPr>
-          <w:rFonts w:ascii="Consolas" w:hAnsi="Consolas"/>
-          <w:color w:val="1F4E8C"/>
-          <w:sz w:val="19"/>
-        </w:rPr>
-        <w:t>| **Subscription expiry** | Daily 07:15 UTC, GitHub Actions | Expires paid plans and sponsorships that have lapsed. | \</w:t>
-      </w:r>
-      <w:r>
-        <w:t>.github/workflows/subscription-expiry.yml\` |</w:t>
-      </w:r>
-    </w:p>
-    <w:p>
-      <w:r>
-        <w:rPr>
-          <w:rFonts w:ascii="Consolas" w:hAnsi="Consolas"/>
-          <w:color w:val="1F4E8C"/>
-          <w:sz w:val="19"/>
-        </w:rPr>
-      </w:r>
-    </w:p>
-    <w:p>
-      <w:r>
-        <w:rPr>
-          <w:rFonts w:ascii="Consolas" w:hAnsi="Consolas"/>
-          <w:color w:val="1F4E8C"/>
-          <w:sz w:val="19"/>
-        </w:rPr>
-        <w:t>How agent output reaches the site: the agent commits a SQL file, and the deploy workflow (runs on every push to \</w:t>
-      </w:r>
-      <w:r>
-        <w:t>main\</w:t>
-      </w:r>
-      <w:r>
-        <w:rPr>
-          <w:rFonts w:ascii="Consolas" w:hAnsi="Consolas"/>
-          <w:color w:val="1F4E8C"/>
-          <w:sz w:val="19"/>
-        </w:rPr>
-        <w:t>) applies it to the live database, rebuilds the snapshot in \</w:t>
-      </w:r>
-      <w:r>
-        <w:t>status/&lt;city&gt;/db-snapshot.json\` and redeploys all three sites.</w:t>
-      </w:r>
-    </w:p>
-    <w:p>
-      <w:r>
-        <w:rPr>
-          <w:rFonts w:ascii="Consolas" w:hAnsi="Consolas"/>
-          <w:color w:val="1F4E8C"/>
-          <w:sz w:val="19"/>
-        </w:rPr>
-      </w:r>
-    </w:p>
-    <w:p>
-      <w:r>
-        <w:t>`## 2. What is inefficient today</w:t>
-      </w:r>
-    </w:p>
-    <w:p>
-      <w:r>
-        <w:rPr>
-          <w:rFonts w:ascii="Consolas" w:hAnsi="Consolas"/>
-          <w:color w:val="1F4E8C"/>
-          <w:sz w:val="19"/>
-        </w:rPr>
-      </w:r>
-    </w:p>
-    <w:p>
-      <w:r>
-        <w:t xml:space="preserve">`1. </w:t>
-      </w:r>
+      <w:pPr>
+        <w:pStyle w:val="ListNumber"/>
+      </w:pPr>
       <w:r>
         <w:rPr>
           <w:b/>
@@ -266,9 +597,9 @@
       </w:r>
     </w:p>
     <w:p>
-      <w:r>
-        <w:t xml:space="preserve">`2. </w:t>
-      </w:r>
+      <w:pPr>
+        <w:pStyle w:val="ListNumber"/>
+      </w:pPr>
       <w:r>
         <w:rPr>
           <w:b/>
@@ -280,9 +611,9 @@
       </w:r>
     </w:p>
     <w:p>
-      <w:r>
-        <w:t xml:space="preserve">`3. </w:t>
-      </w:r>
+      <w:pPr>
+        <w:pStyle w:val="ListNumber"/>
+      </w:pPr>
       <w:r>
         <w:rPr>
           <w:b/>
@@ -294,9 +625,9 @@
       </w:r>
     </w:p>
     <w:p>
-      <w:r>
-        <w:t xml:space="preserve">`4. </w:t>
-      </w:r>
+      <w:pPr>
+        <w:pStyle w:val="ListNumber"/>
+      </w:pPr>
       <w:r>
         <w:rPr>
           <w:b/>
@@ -308,9 +639,9 @@
       </w:r>
     </w:p>
     <w:p>
-      <w:r>
-        <w:t xml:space="preserve">`5. </w:t>
-      </w:r>
+      <w:pPr>
+        <w:pStyle w:val="ListNumber"/>
+      </w:pPr>
       <w:r>
         <w:rPr>
           <w:b/>
@@ -322,9 +653,9 @@
       </w:r>
     </w:p>
     <w:p>
-      <w:r>
-        <w:t xml:space="preserve">`6. </w:t>
-      </w:r>
+      <w:pPr>
+        <w:pStyle w:val="ListNumber"/>
+      </w:pPr>
       <w:r>
         <w:rPr>
           <w:b/>
@@ -336,9 +667,9 @@
       </w:r>
     </w:p>
     <w:p>
-      <w:r>
-        <w:t xml:space="preserve">`7. </w:t>
-      </w:r>
+      <w:pPr>
+        <w:pStyle w:val="ListNumber"/>
+      </w:pPr>
       <w:r>
         <w:rPr>
           <w:b/>
@@ -350,32 +681,17 @@
       </w:r>
     </w:p>
     <w:p>
+      <w:pPr>
+        <w:pStyle w:val="Heading1"/>
+      </w:pPr>
       <w:r>
-        <w:rPr>
-          <w:rFonts w:ascii="Consolas" w:hAnsi="Consolas"/>
-          <w:color w:val="1F4E8C"/>
-          <w:sz w:val="19"/>
-        </w:rPr>
+        <w:t>3. Principles for the rewrite</w:t>
       </w:r>
     </w:p>
     <w:p>
-      <w:r>
-        <w:t>`## 3. Principles for the rewrite</w:t>
-      </w:r>
-    </w:p>
-    <w:p>
-      <w:r>
-        <w:rPr>
-          <w:rFonts w:ascii="Consolas" w:hAnsi="Consolas"/>
-          <w:color w:val="1F4E8C"/>
-          <w:sz w:val="19"/>
-        </w:rPr>
-      </w:r>
-    </w:p>
-    <w:p>
-      <w:r>
-        <w:t xml:space="preserve">`1. </w:t>
-      </w:r>
+      <w:pPr>
+        <w:pStyle w:val="ListNumber"/>
+      </w:pPr>
       <w:r>
         <w:rPr>
           <w:b/>
@@ -387,9 +703,9 @@
       </w:r>
     </w:p>
     <w:p>
-      <w:r>
-        <w:t xml:space="preserve">`2. </w:t>
-      </w:r>
+      <w:pPr>
+        <w:pStyle w:val="ListNumber"/>
+      </w:pPr>
       <w:r>
         <w:rPr>
           <w:b/>
@@ -401,9 +717,9 @@
       </w:r>
     </w:p>
     <w:p>
-      <w:r>
-        <w:t xml:space="preserve">`3. </w:t>
-      </w:r>
+      <w:pPr>
+        <w:pStyle w:val="ListNumber"/>
+      </w:pPr>
       <w:r>
         <w:rPr>
           <w:b/>
@@ -415,9 +731,9 @@
       </w:r>
     </w:p>
     <w:p>
-      <w:r>
-        <w:t xml:space="preserve">`4. </w:t>
-      </w:r>
+      <w:pPr>
+        <w:pStyle w:val="ListNumber"/>
+      </w:pPr>
       <w:r>
         <w:rPr>
           <w:b/>
@@ -429,9 +745,9 @@
       </w:r>
     </w:p>
     <w:p>
-      <w:r>
-        <w:t xml:space="preserve">`5. </w:t>
-      </w:r>
+      <w:pPr>
+        <w:pStyle w:val="ListNumber"/>
+      </w:pPr>
       <w:r>
         <w:rPr>
           <w:b/>
@@ -443,9 +759,9 @@
       </w:r>
     </w:p>
     <w:p>
-      <w:r>
-        <w:t xml:space="preserve">`6. </w:t>
-      </w:r>
+      <w:pPr>
+        <w:pStyle w:val="ListNumber"/>
+      </w:pPr>
       <w:r>
         <w:rPr>
           <w:b/>
@@ -457,9 +773,9 @@
       </w:r>
     </w:p>
     <w:p>
-      <w:r>
-        <w:t xml:space="preserve">`7. </w:t>
-      </w:r>
+      <w:pPr>
+        <w:pStyle w:val="ListNumber"/>
+      </w:pPr>
       <w:r>
         <w:rPr>
           <w:b/>
@@ -471,22 +787,34 @@
       </w:r>
     </w:p>
     <w:p>
+      <w:pPr>
+        <w:pStyle w:val="ListNumber"/>
+      </w:pPr>
+      <w:r>
+        <w:rPr>
+          <w:b/>
+        </w:rPr>
+        <w:t>Every write is idempotent and guarded</w:t>
+      </w:r>
+      <w:r>
+        <w:t xml:space="preserve"> (already the rule today: one-time flags such as </w:t>
+      </w:r>
       <w:r>
         <w:rPr>
           <w:rFonts w:ascii="Consolas" w:hAnsi="Consolas"/>
           <w:color w:val="1F4E8C"/>
           <w:sz w:val="19"/>
         </w:rPr>
-        <w:t>8. **Every write is idempotent and guarded** (already the rule today: one-time flags such as \</w:t>
+        <w:t>description_enriched_at IS NULL</w:t>
       </w:r>
       <w:r>
-        <w:t>description_enriched_at IS NULL\`). Keep that.</w:t>
+        <w:t>). Keep that.</w:t>
       </w:r>
     </w:p>
     <w:p>
-      <w:r>
-        <w:t xml:space="preserve">`9. </w:t>
-      </w:r>
+      <w:pPr>
+        <w:pStyle w:val="ListNumber"/>
+      </w:pPr>
       <w:r>
         <w:rPr>
           <w:b/>
@@ -498,289 +826,984 @@
       </w:r>
     </w:p>
     <w:p>
+      <w:pPr>
+        <w:pStyle w:val="Heading1"/>
+      </w:pPr>
+      <w:r>
+        <w:t>4. Target set of routines</w:t>
+      </w:r>
+    </w:p>
+    <w:p>
+      <w:pPr>
+        <w:pStyle w:val="Heading2"/>
+      </w:pPr>
+      <w:r>
+        <w:t>4.1 Rewrite what exists</w:t>
+      </w:r>
+    </w:p>
+    <w:tbl>
+      <w:tblPr>
+        <w:tblStyle w:val="TableGrid"/>
+        <w:tblW w:type="auto" w:w="0"/>
+        <w:tblLook w:firstColumn="1" w:firstRow="1" w:lastColumn="0" w:lastRow="0" w:noHBand="0" w:noVBand="1" w:val="04A0"/>
+      </w:tblPr>
+      <w:tblGrid>
+        <w:gridCol w:w="4986"/>
+        <w:gridCol w:w="4986"/>
+      </w:tblGrid>
+      <w:tr>
+        <w:tc>
+          <w:tcPr>
+            <w:tcW w:type="dxa" w:w="4986"/>
+            <w:shd w:val="clear" w:color="auto" w:fill="0A2540"/>
+          </w:tcPr>
+          <w:p>
+            <w:r>
+              <w:rPr>
+                <w:b/>
+                <w:color w:val="FFFFFF"/>
+              </w:rPr>
+            </w:r>
+            <w:r>
+              <w:rPr>
+                <w:b/>
+                <w:color w:val="FFFFFF"/>
+                <w:sz w:val="19"/>
+              </w:rPr>
+              <w:t>Routine</w:t>
+            </w:r>
+          </w:p>
+        </w:tc>
+        <w:tc>
+          <w:tcPr>
+            <w:tcW w:type="dxa" w:w="4986"/>
+            <w:shd w:val="clear" w:color="auto" w:fill="0A2540"/>
+          </w:tcPr>
+          <w:p>
+            <w:r>
+              <w:rPr>
+                <w:b/>
+                <w:color w:val="FFFFFF"/>
+              </w:rPr>
+            </w:r>
+            <w:r>
+              <w:rPr>
+                <w:b/>
+                <w:color w:val="FFFFFF"/>
+                <w:sz w:val="19"/>
+              </w:rPr>
+              <w:t>New shape</w:t>
+            </w:r>
+          </w:p>
+        </w:tc>
+      </w:tr>
+      <w:tr>
+        <w:tc>
+          <w:tcPr>
+            <w:tcW w:type="dxa" w:w="4986"/>
+          </w:tcPr>
+          <w:p>
+            <w:r/>
+            <w:r>
+              <w:rPr>
+                <w:b/>
+                <w:sz w:val="19"/>
+              </w:rPr>
+              <w:t>Business discovery</w:t>
+            </w:r>
+            <w:r>
+              <w:rPr>
+                <w:sz w:val="19"/>
+              </w:rPr>
+              <w:t xml:space="preserve"> (jobs 1 and 2)</w:t>
+            </w:r>
+          </w:p>
+        </w:tc>
+        <w:tc>
+          <w:tcPr>
+            <w:tcW w:type="dxa" w:w="4986"/>
+          </w:tcPr>
+          <w:p>
+            <w:r/>
+            <w:r>
+              <w:rPr>
+                <w:sz w:val="19"/>
+              </w:rPr>
+              <w:t>One shared runbook + city config. A script picks the next suburbs and pre-computes the list of known businesses for just those suburbs (phone and address dedupe done by script, including neighbouring suburbs). Agent searches and verifies only. Cadence adapts: hourly while a city has unfinished suburbs, then weekly.</w:t>
+            </w:r>
+          </w:p>
+        </w:tc>
+      </w:tr>
+      <w:tr>
+        <w:tc>
+          <w:tcPr>
+            <w:tcW w:type="dxa" w:w="4986"/>
+          </w:tcPr>
+          <w:p>
+            <w:r/>
+            <w:r>
+              <w:rPr>
+                <w:b/>
+                <w:sz w:val="19"/>
+              </w:rPr>
+              <w:t>Shopping centre sweep</w:t>
+            </w:r>
+            <w:r>
+              <w:rPr>
+                <w:sz w:val="19"/>
+              </w:rPr>
+              <w:t xml:space="preserve"> (job 3, new-mall discovery)</w:t>
+            </w:r>
+          </w:p>
+        </w:tc>
+        <w:tc>
+          <w:tcPr>
+            <w:tcW w:type="dxa" w:w="4986"/>
+          </w:tcPr>
+          <w:p>
+            <w:r/>
+            <w:r>
+              <w:rPr>
+                <w:sz w:val="19"/>
+              </w:rPr>
+              <w:t>Its own weekly routine instead of a job inside the hourly one. New-mall discovery monthly.</w:t>
+            </w:r>
+          </w:p>
+        </w:tc>
+      </w:tr>
+      <w:tr>
+        <w:tc>
+          <w:tcPr>
+            <w:tcW w:type="dxa" w:w="4986"/>
+          </w:tcPr>
+          <w:p>
+            <w:r/>
+            <w:r>
+              <w:rPr>
+                <w:b/>
+                <w:sz w:val="19"/>
+              </w:rPr>
+              <w:t>Description and hours enrichment</w:t>
+            </w:r>
+            <w:r>
+              <w:rPr>
+                <w:sz w:val="19"/>
+              </w:rPr>
+              <w:t xml:space="preserve"> (job 4)</w:t>
+            </w:r>
+          </w:p>
+        </w:tc>
+        <w:tc>
+          <w:tcPr>
+            <w:tcW w:type="dxa" w:w="4986"/>
+          </w:tcPr>
+          <w:p>
+            <w:r/>
+            <w:r>
+              <w:rPr>
+                <w:sz w:val="19"/>
+              </w:rPr>
+              <w:t>Its own daily batch routine. Script hands the agent the next batch of businesses that still lack enrichment. Also fills business emails (see 4.2).</w:t>
+            </w:r>
+          </w:p>
+        </w:tc>
+      </w:tr>
+      <w:tr>
+        <w:tc>
+          <w:tcPr>
+            <w:tcW w:type="dxa" w:w="4986"/>
+          </w:tcPr>
+          <w:p>
+            <w:r/>
+            <w:r>
+              <w:rPr>
+                <w:b/>
+                <w:sz w:val="19"/>
+              </w:rPr>
+              <w:t>Closed-business check</w:t>
+            </w:r>
+            <w:r>
+              <w:rPr>
+                <w:sz w:val="19"/>
+              </w:rPr>
+              <w:t xml:space="preserve"> (job 5)</w:t>
+            </w:r>
+          </w:p>
+        </w:tc>
+        <w:tc>
+          <w:tcPr>
+            <w:tcW w:type="dxa" w:w="4986"/>
+          </w:tcPr>
+          <w:p>
+            <w:r/>
+            <w:r>
+              <w:rPr>
+                <w:sz w:val="19"/>
+              </w:rPr>
+              <w:t>Weekly, script-first: check the business's website and phone status; the agent only decides the unclear cases. Never deletes, only hides (as today).</w:t>
+            </w:r>
+          </w:p>
+        </w:tc>
+      </w:tr>
+      <w:tr>
+        <w:tc>
+          <w:tcPr>
+            <w:tcW w:type="dxa" w:w="4986"/>
+          </w:tcPr>
+          <w:p>
+            <w:r/>
+            <w:r>
+              <w:rPr>
+                <w:b/>
+                <w:sz w:val="19"/>
+              </w:rPr>
+              <w:t>Events</w:t>
+            </w:r>
+          </w:p>
+        </w:tc>
+        <w:tc>
+          <w:tcPr>
+            <w:tcW w:type="dxa" w:w="4986"/>
+          </w:tcPr>
+          <w:p>
+            <w:r/>
+            <w:r>
+              <w:rPr>
+                <w:sz w:val="19"/>
+              </w:rPr>
+              <w:t>One shared runbook, weekly. Script drops events already past and skips sources unchanged since last run.</w:t>
+            </w:r>
+          </w:p>
+        </w:tc>
+      </w:tr>
+      <w:tr>
+        <w:tc>
+          <w:tcPr>
+            <w:tcW w:type="dxa" w:w="4986"/>
+          </w:tcPr>
+          <w:p>
+            <w:r/>
+            <w:r>
+              <w:rPr>
+                <w:b/>
+                <w:sz w:val="19"/>
+              </w:rPr>
+              <w:t>News</w:t>
+            </w:r>
+          </w:p>
+        </w:tc>
+        <w:tc>
+          <w:tcPr>
+            <w:tcW w:type="dxa" w:w="4986"/>
+          </w:tcPr>
+          <w:p>
+            <w:r/>
+            <w:r>
+              <w:rPr>
+                <w:sz w:val="19"/>
+              </w:rPr>
+              <w:t xml:space="preserve">One shared runbook, daily. Each source fetched once; </w:t>
+            </w:r>
+            <w:r>
+              <w:rPr>
+                <w:rFonts w:ascii="Consolas" w:hAnsi="Consolas"/>
+                <w:color w:val="1F4E8C"/>
+                <w:sz w:val="17"/>
+              </w:rPr>
+              <w:t>npm run check:news</w:t>
+            </w:r>
+            <w:r>
+              <w:rPr>
+                <w:sz w:val="19"/>
+              </w:rPr>
+              <w:t xml:space="preserve"> must pass before push; fuel prices only in the monthly window, not daily. Raise the 20-second fetch timeout that is flaky on the City of Cape Town site.</w:t>
+            </w:r>
+          </w:p>
+        </w:tc>
+      </w:tr>
+      <w:tr>
+        <w:tc>
+          <w:tcPr>
+            <w:tcW w:type="dxa" w:w="4986"/>
+          </w:tcPr>
+          <w:p>
+            <w:r/>
+            <w:r>
+              <w:rPr>
+                <w:b/>
+                <w:sz w:val="19"/>
+              </w:rPr>
+              <w:t>Owner reminders, subscription expiry</w:t>
+            </w:r>
+          </w:p>
+        </w:tc>
+        <w:tc>
+          <w:tcPr>
+            <w:tcW w:type="dxa" w:w="4986"/>
+          </w:tcPr>
+          <w:p>
+            <w:r/>
+            <w:r>
+              <w:rPr>
+                <w:sz w:val="19"/>
+              </w:rPr>
+              <w:t>Keep as GitHub Actions. Review the schedule and add failure alerts.</w:t>
+            </w:r>
+          </w:p>
+        </w:tc>
+      </w:tr>
+    </w:tbl>
+    <w:p/>
+    <w:p>
+      <w:pPr>
+        <w:pStyle w:val="Heading2"/>
+      </w:pPr>
+      <w:r>
+        <w:t>4.2 New routines</w:t>
+      </w:r>
+    </w:p>
+    <w:tbl>
+      <w:tblPr>
+        <w:tblStyle w:val="TableGrid"/>
+        <w:tblW w:type="auto" w:w="0"/>
+        <w:tblLook w:firstColumn="1" w:firstRow="1" w:lastColumn="0" w:lastRow="0" w:noHBand="0" w:noVBand="1" w:val="04A0"/>
+      </w:tblPr>
+      <w:tblGrid>
+        <w:gridCol w:w="2493"/>
+        <w:gridCol w:w="2493"/>
+        <w:gridCol w:w="2493"/>
+        <w:gridCol w:w="2493"/>
+      </w:tblGrid>
+      <w:tr>
+        <w:tc>
+          <w:tcPr>
+            <w:tcW w:type="dxa" w:w="2493"/>
+            <w:shd w:val="clear" w:color="auto" w:fill="0A2540"/>
+          </w:tcPr>
+          <w:p>
+            <w:r>
+              <w:rPr>
+                <w:b/>
+                <w:color w:val="FFFFFF"/>
+              </w:rPr>
+            </w:r>
+            <w:r>
+              <w:rPr>
+                <w:b/>
+                <w:color w:val="FFFFFF"/>
+                <w:sz w:val="19"/>
+              </w:rPr>
+              <w:t>Routine</w:t>
+            </w:r>
+          </w:p>
+        </w:tc>
+        <w:tc>
+          <w:tcPr>
+            <w:tcW w:type="dxa" w:w="2493"/>
+            <w:shd w:val="clear" w:color="auto" w:fill="0A2540"/>
+          </w:tcPr>
+          <w:p>
+            <w:r>
+              <w:rPr>
+                <w:b/>
+                <w:color w:val="FFFFFF"/>
+              </w:rPr>
+            </w:r>
+            <w:r>
+              <w:rPr>
+                <w:b/>
+                <w:color w:val="FFFFFF"/>
+                <w:sz w:val="19"/>
+              </w:rPr>
+              <w:t>Purpose</w:t>
+            </w:r>
+          </w:p>
+        </w:tc>
+        <w:tc>
+          <w:tcPr>
+            <w:tcW w:type="dxa" w:w="2493"/>
+            <w:shd w:val="clear" w:color="auto" w:fill="0A2540"/>
+          </w:tcPr>
+          <w:p>
+            <w:r>
+              <w:rPr>
+                <w:b/>
+                <w:color w:val="FFFFFF"/>
+              </w:rPr>
+            </w:r>
+            <w:r>
+              <w:rPr>
+                <w:b/>
+                <w:color w:val="FFFFFF"/>
+                <w:sz w:val="19"/>
+              </w:rPr>
+              <w:t>Runs</w:t>
+            </w:r>
+          </w:p>
+        </w:tc>
+        <w:tc>
+          <w:tcPr>
+            <w:tcW w:type="dxa" w:w="2493"/>
+            <w:shd w:val="clear" w:color="auto" w:fill="0A2540"/>
+          </w:tcPr>
+          <w:p>
+            <w:r>
+              <w:rPr>
+                <w:b/>
+                <w:color w:val="FFFFFF"/>
+              </w:rPr>
+            </w:r>
+            <w:r>
+              <w:rPr>
+                <w:b/>
+                <w:color w:val="FFFFFF"/>
+                <w:sz w:val="19"/>
+              </w:rPr>
+              <w:t>Executed by</w:t>
+            </w:r>
+          </w:p>
+        </w:tc>
+      </w:tr>
+      <w:tr>
+        <w:tc>
+          <w:tcPr>
+            <w:tcW w:type="dxa" w:w="2493"/>
+          </w:tcPr>
+          <w:p>
+            <w:r/>
+            <w:r>
+              <w:rPr>
+                <w:b/>
+                <w:sz w:val="19"/>
+              </w:rPr>
+              <w:t>Business emails and websites</w:t>
+            </w:r>
+          </w:p>
+        </w:tc>
+        <w:tc>
+          <w:tcPr>
+            <w:tcW w:type="dxa" w:w="2493"/>
+          </w:tcPr>
+          <w:p>
+            <w:r/>
+            <w:r>
+              <w:rPr>
+                <w:sz w:val="19"/>
+              </w:rPr>
+              <w:t>Keep website links honest (dead ones cleared, like the four cleared on 20 Sept) and collect a public contact email from each business's own site. Only 2 to 7% of listings have an email today, so most claims still need manual review instead of verification at the business inbox.</w:t>
+            </w:r>
+          </w:p>
+        </w:tc>
+        <w:tc>
+          <w:tcPr>
+            <w:tcW w:type="dxa" w:w="2493"/>
+          </w:tcPr>
+          <w:p>
+            <w:r/>
+            <w:r>
+              <w:rPr>
+                <w:sz w:val="19"/>
+              </w:rPr>
+              <w:t>Weekly</w:t>
+            </w:r>
+          </w:p>
+        </w:tc>
+        <w:tc>
+          <w:tcPr>
+            <w:tcW w:type="dxa" w:w="2493"/>
+          </w:tcPr>
+          <w:p>
+            <w:r/>
+            <w:r>
+              <w:rPr>
+                <w:sz w:val="19"/>
+              </w:rPr>
+              <w:t>Script; agent only for unclear cases</w:t>
+            </w:r>
+          </w:p>
+        </w:tc>
+      </w:tr>
+      <w:tr>
+        <w:tc>
+          <w:tcPr>
+            <w:tcW w:type="dxa" w:w="2493"/>
+          </w:tcPr>
+          <w:p>
+            <w:r/>
+            <w:r>
+              <w:rPr>
+                <w:b/>
+                <w:sz w:val="19"/>
+              </w:rPr>
+              <w:t>Tourism refresh</w:t>
+            </w:r>
+          </w:p>
+        </w:tc>
+        <w:tc>
+          <w:tcPr>
+            <w:tcW w:type="dxa" w:w="2493"/>
+          </w:tcPr>
+          <w:p>
+            <w:r/>
+            <w:r>
+              <w:rPr>
+                <w:sz w:val="19"/>
+              </w:rPr>
+              <w:t>Re-check attraction prices, opening hours and closures on the Things to do page (the mockup's prices and times are placeholders to confirm) and propose new attractions.</w:t>
+            </w:r>
+          </w:p>
+        </w:tc>
+        <w:tc>
+          <w:tcPr>
+            <w:tcW w:type="dxa" w:w="2493"/>
+          </w:tcPr>
+          <w:p>
+            <w:r/>
+            <w:r>
+              <w:rPr>
+                <w:sz w:val="19"/>
+              </w:rPr>
+              <w:t>Monthly, per city</w:t>
+            </w:r>
+          </w:p>
+        </w:tc>
+        <w:tc>
+          <w:tcPr>
+            <w:tcW w:type="dxa" w:w="2493"/>
+          </w:tcPr>
+          <w:p>
+            <w:r/>
+            <w:r>
+              <w:rPr>
+                <w:sz w:val="19"/>
+              </w:rPr>
+              <w:t>Agent, with a script that diffs against the current content</w:t>
+            </w:r>
+          </w:p>
+        </w:tc>
+      </w:tr>
+      <w:tr>
+        <w:tc>
+          <w:tcPr>
+            <w:tcW w:type="dxa" w:w="2493"/>
+          </w:tcPr>
+          <w:p>
+            <w:r/>
+            <w:r>
+              <w:rPr>
+                <w:b/>
+                <w:sz w:val="19"/>
+              </w:rPr>
+              <w:t>Database backup</w:t>
+            </w:r>
+          </w:p>
+        </w:tc>
+        <w:tc>
+          <w:tcPr>
+            <w:tcW w:type="dxa" w:w="2493"/>
+          </w:tcPr>
+          <w:p>
+            <w:r/>
+            <w:r>
+              <w:rPr>
+                <w:sz w:val="19"/>
+              </w:rPr>
+              <w:t>Export all three databases to storage, keep a set number of weeks. Replaces the manual launch-day backup.</w:t>
+            </w:r>
+          </w:p>
+        </w:tc>
+        <w:tc>
+          <w:tcPr>
+            <w:tcW w:type="dxa" w:w="2493"/>
+          </w:tcPr>
+          <w:p>
+            <w:r/>
+            <w:r>
+              <w:rPr>
+                <w:sz w:val="19"/>
+              </w:rPr>
+              <w:t>Weekly</w:t>
+            </w:r>
+          </w:p>
+        </w:tc>
+        <w:tc>
+          <w:tcPr>
+            <w:tcW w:type="dxa" w:w="2493"/>
+          </w:tcPr>
+          <w:p>
+            <w:r/>
+            <w:r>
+              <w:rPr>
+                <w:sz w:val="19"/>
+              </w:rPr>
+              <w:t>GitHub Action (</w:t>
+            </w:r>
+            <w:r>
+              <w:rPr>
+                <w:rFonts w:ascii="Consolas" w:hAnsi="Consolas"/>
+                <w:color w:val="1F4E8C"/>
+                <w:sz w:val="17"/>
+              </w:rPr>
+              <w:t>wrangler d1 export</w:t>
+            </w:r>
+            <w:r>
+              <w:rPr>
+                <w:sz w:val="19"/>
+              </w:rPr>
+              <w:t>)</w:t>
+            </w:r>
+          </w:p>
+        </w:tc>
+      </w:tr>
+      <w:tr>
+        <w:tc>
+          <w:tcPr>
+            <w:tcW w:type="dxa" w:w="2493"/>
+          </w:tcPr>
+          <w:p>
+            <w:r/>
+            <w:r>
+              <w:rPr>
+                <w:b/>
+                <w:sz w:val="19"/>
+              </w:rPr>
+              <w:t>Data health report</w:t>
+            </w:r>
+          </w:p>
+        </w:tc>
+        <w:tc>
+          <w:tcPr>
+            <w:tcW w:type="dxa" w:w="2493"/>
+          </w:tcPr>
+          <w:p>
+            <w:r/>
+            <w:r>
+              <w:rPr>
+                <w:sz w:val="19"/>
+              </w:rPr>
+              <w:t>Counts of businesses with no category, hours, email or website, suburbs without an outline, and stale content. Shown on the admin overview.</w:t>
+            </w:r>
+          </w:p>
+        </w:tc>
+        <w:tc>
+          <w:tcPr>
+            <w:tcW w:type="dxa" w:w="2493"/>
+          </w:tcPr>
+          <w:p>
+            <w:r/>
+            <w:r>
+              <w:rPr>
+                <w:sz w:val="19"/>
+              </w:rPr>
+              <w:t>Weekly</w:t>
+            </w:r>
+          </w:p>
+        </w:tc>
+        <w:tc>
+          <w:tcPr>
+            <w:tcW w:type="dxa" w:w="2493"/>
+          </w:tcPr>
+          <w:p>
+            <w:r/>
+            <w:r>
+              <w:rPr>
+                <w:sz w:val="19"/>
+              </w:rPr>
+              <w:t>Script</w:t>
+            </w:r>
+          </w:p>
+        </w:tc>
+      </w:tr>
+      <w:tr>
+        <w:tc>
+          <w:tcPr>
+            <w:tcW w:type="dxa" w:w="2493"/>
+          </w:tcPr>
+          <w:p>
+            <w:r/>
+            <w:r>
+              <w:rPr>
+                <w:b/>
+                <w:sz w:val="19"/>
+              </w:rPr>
+              <w:t>Tidy expired content</w:t>
+            </w:r>
+          </w:p>
+        </w:tc>
+        <w:tc>
+          <w:tcPr>
+            <w:tcW w:type="dxa" w:w="2493"/>
+          </w:tcPr>
+          <w:p>
+            <w:r/>
+            <w:r>
+              <w:rPr>
+                <w:sz w:val="19"/>
+              </w:rPr>
+              <w:t>Remove events that have passed and news older than the cut-off so pages never show old content.</w:t>
+            </w:r>
+          </w:p>
+        </w:tc>
+        <w:tc>
+          <w:tcPr>
+            <w:tcW w:type="dxa" w:w="2493"/>
+          </w:tcPr>
+          <w:p>
+            <w:r/>
+            <w:r>
+              <w:rPr>
+                <w:sz w:val="19"/>
+              </w:rPr>
+              <w:t>Daily</w:t>
+            </w:r>
+          </w:p>
+        </w:tc>
+        <w:tc>
+          <w:tcPr>
+            <w:tcW w:type="dxa" w:w="2493"/>
+          </w:tcPr>
+          <w:p>
+            <w:r/>
+            <w:r>
+              <w:rPr>
+                <w:sz w:val="19"/>
+              </w:rPr>
+              <w:t>Script</w:t>
+            </w:r>
+          </w:p>
+        </w:tc>
+      </w:tr>
+      <w:tr>
+        <w:tc>
+          <w:tcPr>
+            <w:tcW w:type="dxa" w:w="2493"/>
+          </w:tcPr>
+          <w:p>
+            <w:r/>
+            <w:r>
+              <w:rPr>
+                <w:b/>
+                <w:sz w:val="19"/>
+              </w:rPr>
+              <w:t>Suburb boundaries</w:t>
+            </w:r>
+          </w:p>
+        </w:tc>
+        <w:tc>
+          <w:tcPr>
+            <w:tcW w:type="dxa" w:w="2493"/>
+          </w:tcPr>
+          <w:p>
+            <w:r/>
+            <w:r>
+              <w:rPr>
+                <w:sz w:val="19"/>
+              </w:rPr>
+              <w:t>Refresh the outlines used by the interactive map from the municipal open data.</w:t>
+            </w:r>
+          </w:p>
+        </w:tc>
+        <w:tc>
+          <w:tcPr>
+            <w:tcW w:type="dxa" w:w="2493"/>
+          </w:tcPr>
+          <w:p>
+            <w:r/>
+            <w:r>
+              <w:rPr>
+                <w:sz w:val="19"/>
+              </w:rPr>
+              <w:t>Yearly</w:t>
+            </w:r>
+          </w:p>
+        </w:tc>
+        <w:tc>
+          <w:tcPr>
+            <w:tcW w:type="dxa" w:w="2493"/>
+          </w:tcPr>
+          <w:p>
+            <w:r/>
+            <w:r>
+              <w:rPr>
+                <w:rFonts w:ascii="Consolas" w:hAnsi="Consolas"/>
+                <w:color w:val="1F4E8C"/>
+                <w:sz w:val="17"/>
+              </w:rPr>
+              <w:t>scripts/fetch-official-boundaries.mjs</w:t>
+            </w:r>
+          </w:p>
+        </w:tc>
+      </w:tr>
+      <w:tr>
+        <w:tc>
+          <w:tcPr>
+            <w:tcW w:type="dxa" w:w="2493"/>
+          </w:tcPr>
+          <w:p>
+            <w:r/>
+            <w:r>
+              <w:rPr>
+                <w:b/>
+                <w:sz w:val="19"/>
+              </w:rPr>
+              <w:t>Guides</w:t>
+            </w:r>
+          </w:p>
+        </w:tc>
+        <w:tc>
+          <w:tcPr>
+            <w:tcW w:type="dxa" w:w="2493"/>
+          </w:tcPr>
+          <w:p>
+            <w:r/>
+            <w:r>
+              <w:rPr>
+                <w:sz w:val="19"/>
+              </w:rPr>
+              <w:t>Draft and refresh the five missing buyer's guides for your review.</w:t>
+            </w:r>
+          </w:p>
+        </w:tc>
+        <w:tc>
+          <w:tcPr>
+            <w:tcW w:type="dxa" w:w="2493"/>
+          </w:tcPr>
+          <w:p>
+            <w:r/>
+            <w:r>
+              <w:rPr>
+                <w:sz w:val="19"/>
+              </w:rPr>
+              <w:t>Quarterly</w:t>
+            </w:r>
+          </w:p>
+        </w:tc>
+        <w:tc>
+          <w:tcPr>
+            <w:tcW w:type="dxa" w:w="2493"/>
+          </w:tcPr>
+          <w:p>
+            <w:r/>
+            <w:r>
+              <w:rPr>
+                <w:sz w:val="19"/>
+              </w:rPr>
+              <w:t>Agent, human review before publish</w:t>
+            </w:r>
+          </w:p>
+        </w:tc>
+      </w:tr>
+      <w:tr>
+        <w:tc>
+          <w:tcPr>
+            <w:tcW w:type="dxa" w:w="2493"/>
+          </w:tcPr>
+          <w:p>
+            <w:r/>
+            <w:r>
+              <w:rPr>
+                <w:b/>
+                <w:sz w:val="19"/>
+              </w:rPr>
+              <w:t>Link and smoke check on production</w:t>
+            </w:r>
+          </w:p>
+        </w:tc>
+        <w:tc>
+          <w:tcPr>
+            <w:tcW w:type="dxa" w:w="2493"/>
+          </w:tcPr>
+          <w:p>
+            <w:r/>
+            <w:r>
+              <w:rPr>
+                <w:sz w:val="19"/>
+              </w:rPr>
+              <w:t xml:space="preserve">Run </w:t>
+            </w:r>
+            <w:r>
+              <w:rPr>
+                <w:rFonts w:ascii="Consolas" w:hAnsi="Consolas"/>
+                <w:color w:val="1F4E8C"/>
+                <w:sz w:val="17"/>
+              </w:rPr>
+              <w:t>npm run check:links</w:t>
+            </w:r>
+            <w:r>
+              <w:rPr>
+                <w:sz w:val="19"/>
+              </w:rPr>
+              <w:t xml:space="preserve"> and </w:t>
+            </w:r>
+            <w:r>
+              <w:rPr>
+                <w:rFonts w:ascii="Consolas" w:hAnsi="Consolas"/>
+                <w:color w:val="1F4E8C"/>
+                <w:sz w:val="17"/>
+              </w:rPr>
+              <w:t>npm run check:smoke</w:t>
+            </w:r>
+            <w:r>
+              <w:rPr>
+                <w:sz w:val="19"/>
+              </w:rPr>
+              <w:t xml:space="preserve"> against the live sites and alert on any failure.</w:t>
+            </w:r>
+          </w:p>
+        </w:tc>
+        <w:tc>
+          <w:tcPr>
+            <w:tcW w:type="dxa" w:w="2493"/>
+          </w:tcPr>
+          <w:p>
+            <w:r/>
+            <w:r>
+              <w:rPr>
+                <w:sz w:val="19"/>
+              </w:rPr>
+              <w:t>Weekly</w:t>
+            </w:r>
+          </w:p>
+        </w:tc>
+        <w:tc>
+          <w:tcPr>
+            <w:tcW w:type="dxa" w:w="2493"/>
+          </w:tcPr>
+          <w:p>
+            <w:r/>
+            <w:r>
+              <w:rPr>
+                <w:sz w:val="19"/>
+              </w:rPr>
+              <w:t>GitHub Action</w:t>
+            </w:r>
+          </w:p>
+        </w:tc>
+      </w:tr>
+    </w:tbl>
+    <w:p/>
+    <w:p>
+      <w:pPr>
+        <w:pStyle w:val="Heading1"/>
+      </w:pPr>
+      <w:r>
+        <w:t>5. Shared infrastructure to build [Me]</w:t>
+      </w:r>
+    </w:p>
+    <w:p>
+      <w:pPr>
+        <w:pStyle w:val="ListNumber"/>
+      </w:pPr>
       <w:r>
         <w:rPr>
           <w:rFonts w:ascii="Consolas" w:hAnsi="Consolas"/>
           <w:color w:val="1F4E8C"/>
           <w:sz w:val="19"/>
         </w:rPr>
-      </w:r>
-    </w:p>
-    <w:p>
-      <w:r>
-        <w:t>`## 4. Target set of routines</w:t>
-      </w:r>
-    </w:p>
-    <w:p>
-      <w:r>
-        <w:rPr>
-          <w:rFonts w:ascii="Consolas" w:hAnsi="Consolas"/>
-          <w:color w:val="1F4E8C"/>
-          <w:sz w:val="19"/>
-        </w:rPr>
-      </w:r>
-    </w:p>
-    <w:p>
-      <w:r>
-        <w:t>`### 4.1 Rewrite what exists</w:t>
-      </w:r>
-    </w:p>
-    <w:p>
-      <w:r>
-        <w:rPr>
-          <w:rFonts w:ascii="Consolas" w:hAnsi="Consolas"/>
-          <w:color w:val="1F4E8C"/>
-          <w:sz w:val="19"/>
-        </w:rPr>
-      </w:r>
-    </w:p>
-    <w:p>
-      <w:r>
-        <w:t>`| Routine | New shape |</w:t>
-      </w:r>
-    </w:p>
-    <w:p>
-      <w:r>
-        <w:t>`|---|---|</w:t>
-      </w:r>
-    </w:p>
-    <w:p>
-      <w:r>
-        <w:t xml:space="preserve">`| </w:t>
+        <w:t>routines/</w:t>
       </w:r>
       <w:r>
-        <w:rPr>
-          <w:b/>
-        </w:rPr>
-        <w:t>Business discovery</w:t>
-      </w:r>
-      <w:r>
-        <w:t xml:space="preserve"> (jobs 1 and 2) | One shared runbook + city config. A script picks the next suburbs and pre-computes the list of known businesses for just those suburbs (phone and address dedupe done by script, including neighbouring suburbs). Agent searches and verifies only. Cadence adapts: hourly while a city has unfinished suburbs, then weekly. |</w:t>
-      </w:r>
-    </w:p>
-    <w:p>
-      <w:r>
-        <w:t xml:space="preserve">`| </w:t>
-      </w:r>
-      <w:r>
-        <w:rPr>
-          <w:b/>
-        </w:rPr>
-        <w:t>Shopping centre sweep</w:t>
-      </w:r>
-      <w:r>
-        <w:t xml:space="preserve"> (job 3, new-mall discovery) | Its own weekly routine instead of a job inside the hourly one. New-mall discovery monthly. |</w:t>
-      </w:r>
-    </w:p>
-    <w:p>
-      <w:r>
-        <w:t xml:space="preserve">`| </w:t>
-      </w:r>
-      <w:r>
-        <w:rPr>
-          <w:b/>
-        </w:rPr>
-        <w:t>Description and hours enrichment</w:t>
-      </w:r>
-      <w:r>
-        <w:t xml:space="preserve"> (job 4) | Its own daily batch routine. Script hands the agent the next batch of businesses that still lack enrichment. Also fills business emails (see 4.2). |</w:t>
-      </w:r>
-    </w:p>
-    <w:p>
-      <w:r>
-        <w:t xml:space="preserve">`| </w:t>
-      </w:r>
-      <w:r>
-        <w:rPr>
-          <w:b/>
-        </w:rPr>
-        <w:t>Closed-business check</w:t>
-      </w:r>
-      <w:r>
-        <w:t xml:space="preserve"> (job 5) | Weekly, script-first: check the business's website and phone status; the agent only decides the unclear cases. Never deletes, only hides (as today). |</w:t>
-      </w:r>
-    </w:p>
-    <w:p>
-      <w:r>
-        <w:t xml:space="preserve">`| </w:t>
-      </w:r>
-      <w:r>
-        <w:rPr>
-          <w:b/>
-        </w:rPr>
-        <w:t>Events</w:t>
-      </w:r>
-      <w:r>
-        <w:t xml:space="preserve"> | One shared runbook, weekly. Script drops events already past and skips sources unchanged since last run. |</w:t>
-      </w:r>
-    </w:p>
-    <w:p>
-      <w:r>
-        <w:rPr>
-          <w:rFonts w:ascii="Consolas" w:hAnsi="Consolas"/>
-          <w:color w:val="1F4E8C"/>
-          <w:sz w:val="19"/>
-        </w:rPr>
-        <w:t>| **News** | One shared runbook, daily. Each source fetched once; \</w:t>
-      </w:r>
-      <w:r>
-        <w:t>npm run check:news\` must pass before push; fuel prices only in the monthly window, not daily. Raise the 20-second fetch timeout that is flaky on the City of Cape Town site. |</w:t>
-      </w:r>
-    </w:p>
-    <w:p>
-      <w:r>
-        <w:t xml:space="preserve">`| </w:t>
-      </w:r>
-      <w:r>
-        <w:rPr>
-          <w:b/>
-        </w:rPr>
-        <w:t>Owner reminders, subscription expiry</w:t>
-      </w:r>
-      <w:r>
-        <w:t xml:space="preserve"> | Keep as GitHub Actions. Review the schedule and add failure alerts. |</w:t>
-      </w:r>
-    </w:p>
-    <w:p>
-      <w:r>
-        <w:rPr>
-          <w:rFonts w:ascii="Consolas" w:hAnsi="Consolas"/>
-          <w:color w:val="1F4E8C"/>
-          <w:sz w:val="19"/>
-        </w:rPr>
-      </w:r>
-    </w:p>
-    <w:p>
-      <w:r>
-        <w:t>`### 4.2 New routines</w:t>
-      </w:r>
-    </w:p>
-    <w:p>
-      <w:r>
-        <w:rPr>
-          <w:rFonts w:ascii="Consolas" w:hAnsi="Consolas"/>
-          <w:color w:val="1F4E8C"/>
-          <w:sz w:val="19"/>
-        </w:rPr>
-      </w:r>
-    </w:p>
-    <w:p>
-      <w:r>
-        <w:t>`| Routine | Purpose | Runs | Executed by |</w:t>
-      </w:r>
-    </w:p>
-    <w:p>
-      <w:r>
-        <w:t>`|---|---|---|---|</w:t>
-      </w:r>
-    </w:p>
-    <w:p>
-      <w:r>
-        <w:t xml:space="preserve">`| </w:t>
-      </w:r>
-      <w:r>
-        <w:rPr>
-          <w:b/>
-        </w:rPr>
-        <w:t>Business emails and websites</w:t>
-      </w:r>
-      <w:r>
-        <w:t xml:space="preserve"> | Keep website links honest (dead ones cleared, like the four cleared on 20 Sept) and collect a public contact email from each business's own site. Only 2 to 7% of listings have an email today, so most claims still need manual review instead of verification at the business inbox. | Weekly | Script; agent only for unclear cases |</w:t>
-      </w:r>
-    </w:p>
-    <w:p>
-      <w:r>
-        <w:t xml:space="preserve">`| </w:t>
-      </w:r>
-      <w:r>
-        <w:rPr>
-          <w:b/>
-        </w:rPr>
-        <w:t>Tourism refresh</w:t>
-      </w:r>
-      <w:r>
-        <w:t xml:space="preserve"> | Re-check attraction prices, opening hours and closures on the Things to do page (the mockup's prices and times are placeholders to confirm) and propose new attractions. | Monthly, per city | Agent, with a script that diffs against the current content |</w:t>
-      </w:r>
-    </w:p>
-    <w:p>
-      <w:r>
-        <w:rPr>
-          <w:rFonts w:ascii="Consolas" w:hAnsi="Consolas"/>
-          <w:color w:val="1F4E8C"/>
-          <w:sz w:val="19"/>
-        </w:rPr>
-        <w:t>| **Database backup** | Export all three databases to storage, keep a set number of weeks. Replaces the manual launch-day backup. | Weekly | GitHub Action (\</w:t>
-      </w:r>
-      <w:r>
-        <w:t>wrangler d1 export\`) |</w:t>
-      </w:r>
-    </w:p>
-    <w:p>
-      <w:r>
-        <w:t xml:space="preserve">`| </w:t>
-      </w:r>
-      <w:r>
-        <w:rPr>
-          <w:b/>
-        </w:rPr>
-        <w:t>Data health report</w:t>
-      </w:r>
-      <w:r>
-        <w:t xml:space="preserve"> | Counts of businesses with no category, hours, email or website, suburbs without an outline, and stale content. Shown on the admin overview. | Weekly | Script |</w:t>
-      </w:r>
-    </w:p>
-    <w:p>
-      <w:r>
-        <w:t xml:space="preserve">`| </w:t>
-      </w:r>
-      <w:r>
-        <w:rPr>
-          <w:b/>
-        </w:rPr>
-        <w:t>Tidy expired content</w:t>
-      </w:r>
-      <w:r>
-        <w:t xml:space="preserve"> | Remove events that have passed and news older than the cut-off so pages never show old content. | Daily | Script |</w:t>
-      </w:r>
-    </w:p>
-    <w:p>
-      <w:r>
-        <w:rPr>
-          <w:rFonts w:ascii="Consolas" w:hAnsi="Consolas"/>
-          <w:color w:val="1F4E8C"/>
-          <w:sz w:val="19"/>
-        </w:rPr>
-        <w:t>| **Suburb boundaries** | Refresh the outlines used by the interactive map from the municipal open data. | Yearly | \</w:t>
-      </w:r>
-      <w:r>
-        <w:t>scripts/fetch-official-boundaries.mjs\` |</w:t>
-      </w:r>
-    </w:p>
-    <w:p>
-      <w:r>
-        <w:t xml:space="preserve">`| </w:t>
-      </w:r>
-      <w:r>
-        <w:rPr>
-          <w:b/>
-        </w:rPr>
-        <w:t>Guides</w:t>
-      </w:r>
-      <w:r>
-        <w:t xml:space="preserve"> | Draft and refresh the five missing buyer's guides for your review. | Quarterly | Agent, human review before publish |</w:t>
-      </w:r>
-    </w:p>
-    <w:p>
-      <w:r>
-        <w:rPr>
-          <w:rFonts w:ascii="Consolas" w:hAnsi="Consolas"/>
-          <w:color w:val="1F4E8C"/>
-          <w:sz w:val="19"/>
-        </w:rPr>
-        <w:t>| **Link and smoke check on production** | Run \</w:t>
-      </w:r>
-      <w:r>
-        <w:t>npm run check:links\</w:t>
+        <w:t xml:space="preserve"> folder: one runbook per routine type, </w:t>
       </w:r>
       <w:r>
         <w:rPr>
@@ -788,46 +1811,10 @@
           <w:color w:val="1F4E8C"/>
           <w:sz w:val="19"/>
         </w:rPr>
-        <w:t xml:space="preserve"> and \</w:t>
+        <w:t>cities/&lt;city&gt;.json</w:t>
       </w:r>
       <w:r>
-        <w:t>npm run check:smoke\` against the live sites and alert on any failure. | Weekly | GitHub Action |</w:t>
-      </w:r>
-    </w:p>
-    <w:p>
-      <w:r>
-        <w:rPr>
-          <w:rFonts w:ascii="Consolas" w:hAnsi="Consolas"/>
-          <w:color w:val="1F4E8C"/>
-          <w:sz w:val="19"/>
-        </w:rPr>
-      </w:r>
-    </w:p>
-    <w:p>
-      <w:r>
-        <w:t>`## 5. Shared infrastructure to build [Me]</w:t>
-      </w:r>
-    </w:p>
-    <w:p>
-      <w:r>
-        <w:rPr>
-          <w:rFonts w:ascii="Consolas" w:hAnsi="Consolas"/>
-          <w:color w:val="1F4E8C"/>
-          <w:sz w:val="19"/>
-        </w:rPr>
-      </w:r>
-    </w:p>
-    <w:p>
-      <w:r>
-        <w:rPr>
-          <w:rFonts w:ascii="Consolas" w:hAnsi="Consolas"/>
-          <w:color w:val="1F4E8C"/>
-          <w:sz w:val="19"/>
-        </w:rPr>
-        <w:t>1. \</w:t>
-      </w:r>
-      <w:r>
-        <w:t>routines/\</w:t>
+        <w:t xml:space="preserve"> per city, and </w:t>
       </w:r>
       <w:r>
         <w:rPr>
@@ -835,40 +1822,32 @@
           <w:color w:val="1F4E8C"/>
           <w:sz w:val="19"/>
         </w:rPr>
-        <w:t xml:space="preserve"> folder: one runbook per routine type, \</w:t>
+        <w:t>scripts/routines/*.mjs</w:t>
       </w:r>
       <w:r>
-        <w:t>cities/&lt;city&gt;.json\</w:t>
+        <w:t xml:space="preserve"> for the mechanical steps.</w:t>
       </w:r>
+    </w:p>
+    <w:p>
+      <w:pPr>
+        <w:pStyle w:val="ListNumber"/>
+      </w:pPr>
       <w:r>
         <w:rPr>
           <w:rFonts w:ascii="Consolas" w:hAnsi="Consolas"/>
           <w:color w:val="1F4E8C"/>
           <w:sz w:val="19"/>
         </w:rPr>
-        <w:t xml:space="preserve"> per city, and \</w:t>
+        <w:t>status/&lt;city&gt;/routine-state.json</w:t>
       </w:r>
       <w:r>
-        <w:t>scripts/routines/*.mjs\` for the mechanical steps.</w:t>
+        <w:t>: one schema for "what was last done and what is due" across all routines (today's file only tracks the suburb rotation).</w:t>
       </w:r>
     </w:p>
     <w:p>
-      <w:r>
-        <w:rPr>
-          <w:rFonts w:ascii="Consolas" w:hAnsi="Consolas"/>
-          <w:color w:val="1F4E8C"/>
-          <w:sz w:val="19"/>
-        </w:rPr>
-        <w:t>2. \</w:t>
-      </w:r>
-      <w:r>
-        <w:t>status/&lt;city&gt;/routine-state.json\`: one schema for "what was last done and what is due" across all routines (today's file only tracks the suburb rotation).</w:t>
-      </w:r>
-    </w:p>
-    <w:p>
-      <w:r>
-        <w:t xml:space="preserve">`3. </w:t>
-      </w:r>
+      <w:pPr>
+        <w:pStyle w:val="ListNumber"/>
+      </w:pPr>
       <w:r>
         <w:rPr>
           <w:b/>
@@ -880,9 +1859,9 @@
       </w:r>
     </w:p>
     <w:p>
-      <w:r>
-        <w:t xml:space="preserve">`4. </w:t>
-      </w:r>
+      <w:pPr>
+        <w:pStyle w:val="ListNumber"/>
+      </w:pPr>
       <w:r>
         <w:rPr>
           <w:b/>
@@ -894,9 +1873,9 @@
       </w:r>
     </w:p>
     <w:p>
-      <w:r>
-        <w:t xml:space="preserve">`5. </w:t>
-      </w:r>
+      <w:pPr>
+        <w:pStyle w:val="ListNumber"/>
+      </w:pPr>
       <w:r>
         <w:rPr>
           <w:b/>
@@ -908,9 +1887,9 @@
       </w:r>
     </w:p>
     <w:p>
-      <w:r>
-        <w:t xml:space="preserve">`6. </w:t>
-      </w:r>
+      <w:pPr>
+        <w:pStyle w:val="ListNumber"/>
+      </w:pPr>
       <w:r>
         <w:rPr>
           <w:b/>
@@ -922,171 +1901,499 @@
       </w:r>
     </w:p>
     <w:p>
+      <w:pPr>
+        <w:pStyle w:val="Heading1"/>
+      </w:pPr>
+      <w:r>
+        <w:t>6. Rollout order</w:t>
+      </w:r>
+    </w:p>
+    <w:tbl>
+      <w:tblPr>
+        <w:tblStyle w:val="TableGrid"/>
+        <w:tblW w:type="auto" w:w="0"/>
+        <w:tblLook w:firstColumn="1" w:firstRow="1" w:lastColumn="0" w:lastRow="0" w:noHBand="0" w:noVBand="1" w:val="04A0"/>
+      </w:tblPr>
+      <w:tblGrid>
+        <w:gridCol w:w="2493"/>
+        <w:gridCol w:w="2493"/>
+        <w:gridCol w:w="2493"/>
+        <w:gridCol w:w="2493"/>
+      </w:tblGrid>
+      <w:tr>
+        <w:tc>
+          <w:tcPr>
+            <w:tcW w:type="dxa" w:w="2493"/>
+            <w:shd w:val="clear" w:color="auto" w:fill="0A2540"/>
+          </w:tcPr>
+          <w:p>
+            <w:r>
+              <w:rPr>
+                <w:b/>
+                <w:color w:val="FFFFFF"/>
+              </w:rPr>
+            </w:r>
+            <w:r>
+              <w:rPr>
+                <w:b/>
+                <w:color w:val="FFFFFF"/>
+                <w:sz w:val="19"/>
+              </w:rPr>
+              <w:t>Phase</w:t>
+            </w:r>
+          </w:p>
+        </w:tc>
+        <w:tc>
+          <w:tcPr>
+            <w:tcW w:type="dxa" w:w="2493"/>
+            <w:shd w:val="clear" w:color="auto" w:fill="0A2540"/>
+          </w:tcPr>
+          <w:p>
+            <w:r>
+              <w:rPr>
+                <w:b/>
+                <w:color w:val="FFFFFF"/>
+              </w:rPr>
+            </w:r>
+            <w:r>
+              <w:rPr>
+                <w:b/>
+                <w:color w:val="FFFFFF"/>
+                <w:sz w:val="19"/>
+              </w:rPr>
+              <w:t>What</w:t>
+            </w:r>
+          </w:p>
+        </w:tc>
+        <w:tc>
+          <w:tcPr>
+            <w:tcW w:type="dxa" w:w="2493"/>
+            <w:shd w:val="clear" w:color="auto" w:fill="0A2540"/>
+          </w:tcPr>
+          <w:p>
+            <w:r>
+              <w:rPr>
+                <w:b/>
+                <w:color w:val="FFFFFF"/>
+              </w:rPr>
+            </w:r>
+            <w:r>
+              <w:rPr>
+                <w:b/>
+                <w:color w:val="FFFFFF"/>
+                <w:sz w:val="19"/>
+              </w:rPr>
+              <w:t>Result</w:t>
+            </w:r>
+          </w:p>
+        </w:tc>
+        <w:tc>
+          <w:tcPr>
+            <w:tcW w:type="dxa" w:w="2493"/>
+            <w:shd w:val="clear" w:color="auto" w:fill="0A2540"/>
+          </w:tcPr>
+          <w:p>
+            <w:r>
+              <w:rPr>
+                <w:b/>
+                <w:color w:val="FFFFFF"/>
+              </w:rPr>
+            </w:r>
+            <w:r>
+              <w:rPr>
+                <w:b/>
+                <w:color w:val="FFFFFF"/>
+                <w:sz w:val="19"/>
+              </w:rPr>
+              <w:t>Owner</w:t>
+            </w:r>
+          </w:p>
+        </w:tc>
+      </w:tr>
+      <w:tr>
+        <w:tc>
+          <w:tcPr>
+            <w:tcW w:type="dxa" w:w="2493"/>
+          </w:tcPr>
+          <w:p>
+            <w:r/>
+            <w:r>
+              <w:rPr>
+                <w:b/>
+                <w:sz w:val="19"/>
+              </w:rPr>
+              <w:t>0. Stop the read waste</w:t>
+            </w:r>
+          </w:p>
+        </w:tc>
+        <w:tc>
+          <w:tcPr>
+            <w:tcW w:type="dxa" w:w="2493"/>
+          </w:tcPr>
+          <w:p>
+            <w:r/>
+            <w:r>
+              <w:rPr>
+                <w:sz w:val="19"/>
+              </w:rPr>
+              <w:t>Batched daily deploy, builds reuse the snapshot. Weekly database backup.</w:t>
+            </w:r>
+          </w:p>
+        </w:tc>
+        <w:tc>
+          <w:tcPr>
+            <w:tcW w:type="dxa" w:w="2493"/>
+          </w:tcPr>
+          <w:p>
+            <w:r/>
+            <w:r>
+              <w:rPr>
+                <w:sz w:val="19"/>
+              </w:rPr>
+              <w:t>No more D1 read-limit surprises; automatic backups.</w:t>
+            </w:r>
+          </w:p>
+        </w:tc>
+        <w:tc>
+          <w:tcPr>
+            <w:tcW w:type="dxa" w:w="2493"/>
+          </w:tcPr>
+          <w:p>
+            <w:r/>
+            <w:r>
+              <w:rPr>
+                <w:sz w:val="19"/>
+              </w:rPr>
+              <w:t>Me</w:t>
+            </w:r>
+          </w:p>
+        </w:tc>
+      </w:tr>
+      <w:tr>
+        <w:tc>
+          <w:tcPr>
+            <w:tcW w:type="dxa" w:w="2493"/>
+          </w:tcPr>
+          <w:p>
+            <w:r/>
+            <w:r>
+              <w:rPr>
+                <w:b/>
+                <w:sz w:val="19"/>
+              </w:rPr>
+              <w:t>1. Visibility</w:t>
+            </w:r>
+          </w:p>
+        </w:tc>
+        <w:tc>
+          <w:tcPr>
+            <w:tcW w:type="dxa" w:w="2493"/>
+          </w:tcPr>
+          <w:p>
+            <w:r/>
+            <w:r>
+              <w:rPr>
+                <w:sz w:val="19"/>
+              </w:rPr>
+              <w:t>Routine health tile, failure emails, data health report.</w:t>
+            </w:r>
+          </w:p>
+        </w:tc>
+        <w:tc>
+          <w:tcPr>
+            <w:tcW w:type="dxa" w:w="2493"/>
+          </w:tcPr>
+          <w:p>
+            <w:r/>
+            <w:r>
+              <w:rPr>
+                <w:sz w:val="19"/>
+              </w:rPr>
+              <w:t>You can see what each routine is doing.</w:t>
+            </w:r>
+          </w:p>
+        </w:tc>
+        <w:tc>
+          <w:tcPr>
+            <w:tcW w:type="dxa" w:w="2493"/>
+          </w:tcPr>
+          <w:p>
+            <w:r/>
+            <w:r>
+              <w:rPr>
+                <w:sz w:val="19"/>
+              </w:rPr>
+              <w:t>Me</w:t>
+            </w:r>
+          </w:p>
+        </w:tc>
+      </w:tr>
+      <w:tr>
+        <w:tc>
+          <w:tcPr>
+            <w:tcW w:type="dxa" w:w="2493"/>
+          </w:tcPr>
+          <w:p>
+            <w:r/>
+            <w:r>
+              <w:rPr>
+                <w:b/>
+                <w:sz w:val="19"/>
+              </w:rPr>
+              <w:t>2. Consolidate</w:t>
+            </w:r>
+          </w:p>
+        </w:tc>
+        <w:tc>
+          <w:tcPr>
+            <w:tcW w:type="dxa" w:w="2493"/>
+          </w:tcPr>
+          <w:p>
+            <w:r/>
+            <w:r>
+              <w:rPr>
+                <w:sz w:val="19"/>
+              </w:rPr>
+              <w:t>One shared runbook per type + city config; shared state schema; snapshot slices.</w:t>
+            </w:r>
+          </w:p>
+        </w:tc>
+        <w:tc>
+          <w:tcPr>
+            <w:tcW w:type="dxa" w:w="2493"/>
+          </w:tcPr>
+          <w:p>
+            <w:r/>
+            <w:r>
+              <w:rPr>
+                <w:sz w:val="19"/>
+              </w:rPr>
+              <w:t>About 2,500 lines of near-copies become one runbook; smaller reads per run.</w:t>
+            </w:r>
+          </w:p>
+        </w:tc>
+        <w:tc>
+          <w:tcPr>
+            <w:tcW w:type="dxa" w:w="2493"/>
+          </w:tcPr>
+          <w:p>
+            <w:r/>
+            <w:r>
+              <w:rPr>
+                <w:sz w:val="19"/>
+              </w:rPr>
+              <w:t>Me</w:t>
+            </w:r>
+          </w:p>
+        </w:tc>
+      </w:tr>
+      <w:tr>
+        <w:tc>
+          <w:tcPr>
+            <w:tcW w:type="dxa" w:w="2493"/>
+          </w:tcPr>
+          <w:p>
+            <w:r/>
+            <w:r>
+              <w:rPr>
+                <w:b/>
+                <w:sz w:val="19"/>
+              </w:rPr>
+              <w:t>3. Move mechanical work to scripts</w:t>
+            </w:r>
+          </w:p>
+        </w:tc>
+        <w:tc>
+          <w:tcPr>
+            <w:tcW w:type="dxa" w:w="2493"/>
+          </w:tcPr>
+          <w:p>
+            <w:r/>
+            <w:r>
+              <w:rPr>
+                <w:sz w:val="19"/>
+              </w:rPr>
+              <w:t>Dedupe, validation, link and website checks, SQL checks, tidy-up.</w:t>
+            </w:r>
+          </w:p>
+        </w:tc>
+        <w:tc>
+          <w:tcPr>
+            <w:tcW w:type="dxa" w:w="2493"/>
+          </w:tcPr>
+          <w:p>
+            <w:r/>
+            <w:r>
+              <w:rPr>
+                <w:sz w:val="19"/>
+              </w:rPr>
+              <w:t>Agent work shrinks to judgement only.</w:t>
+            </w:r>
+          </w:p>
+        </w:tc>
+        <w:tc>
+          <w:tcPr>
+            <w:tcW w:type="dxa" w:w="2493"/>
+          </w:tcPr>
+          <w:p>
+            <w:r/>
+            <w:r>
+              <w:rPr>
+                <w:sz w:val="19"/>
+              </w:rPr>
+              <w:t>Me</w:t>
+            </w:r>
+          </w:p>
+        </w:tc>
+      </w:tr>
+      <w:tr>
+        <w:tc>
+          <w:tcPr>
+            <w:tcW w:type="dxa" w:w="2493"/>
+          </w:tcPr>
+          <w:p>
+            <w:r/>
+            <w:r>
+              <w:rPr>
+                <w:b/>
+                <w:sz w:val="19"/>
+              </w:rPr>
+              <w:t>4. Add the new routines</w:t>
+            </w:r>
+          </w:p>
+        </w:tc>
+        <w:tc>
+          <w:tcPr>
+            <w:tcW w:type="dxa" w:w="2493"/>
+          </w:tcPr>
+          <w:p>
+            <w:r/>
+            <w:r>
+              <w:rPr>
+                <w:sz w:val="19"/>
+              </w:rPr>
+              <w:t>Business emails and websites, tourism refresh, expired content, boundaries, production checks, guides.</w:t>
+            </w:r>
+          </w:p>
+        </w:tc>
+        <w:tc>
+          <w:tcPr>
+            <w:tcW w:type="dxa" w:w="2493"/>
+          </w:tcPr>
+          <w:p>
+            <w:r/>
+            <w:r>
+              <w:rPr>
+                <w:sz w:val="19"/>
+              </w:rPr>
+              <w:t>The gaps in section 2 are closed.</w:t>
+            </w:r>
+          </w:p>
+        </w:tc>
+        <w:tc>
+          <w:tcPr>
+            <w:tcW w:type="dxa" w:w="2493"/>
+          </w:tcPr>
+          <w:p>
+            <w:r/>
+            <w:r>
+              <w:rPr>
+                <w:sz w:val="19"/>
+              </w:rPr>
+              <w:t>Me</w:t>
+            </w:r>
+          </w:p>
+        </w:tc>
+      </w:tr>
+      <w:tr>
+        <w:tc>
+          <w:tcPr>
+            <w:tcW w:type="dxa" w:w="2493"/>
+          </w:tcPr>
+          <w:p>
+            <w:r/>
+            <w:r>
+              <w:rPr>
+                <w:b/>
+                <w:sz w:val="19"/>
+              </w:rPr>
+              <w:t>5. Turn on schedules</w:t>
+            </w:r>
+          </w:p>
+        </w:tc>
+        <w:tc>
+          <w:tcPr>
+            <w:tcW w:type="dxa" w:w="2493"/>
+          </w:tcPr>
+          <w:p>
+            <w:r/>
+            <w:r>
+              <w:rPr>
+                <w:sz w:val="19"/>
+              </w:rPr>
+              <w:t>Create the scheduled cloud agents for each city from the new runbooks; switch off the old ones only after two clean runs each.</w:t>
+            </w:r>
+          </w:p>
+        </w:tc>
+        <w:tc>
+          <w:tcPr>
+            <w:tcW w:type="dxa" w:w="2493"/>
+          </w:tcPr>
+          <w:p>
+            <w:r/>
+            <w:r>
+              <w:rPr>
+                <w:sz w:val="19"/>
+              </w:rPr>
+              <w:t>Rewritten routines are live.</w:t>
+            </w:r>
+          </w:p>
+        </w:tc>
+        <w:tc>
+          <w:tcPr>
+            <w:tcW w:type="dxa" w:w="2493"/>
+          </w:tcPr>
+          <w:p>
+            <w:r/>
+            <w:r>
+              <w:rPr>
+                <w:sz w:val="19"/>
+              </w:rPr>
+              <w:t>You (accounts), Me (runbooks)</w:t>
+            </w:r>
+          </w:p>
+        </w:tc>
+      </w:tr>
+    </w:tbl>
+    <w:p/>
+    <w:p>
+      <w:r>
+        <w:t>Acceptance for each phase: the routine runs cleanly twice in a row on the dev branch, its output passes the existing checks (</w:t>
+      </w:r>
       <w:r>
         <w:rPr>
           <w:rFonts w:ascii="Consolas" w:hAnsi="Consolas"/>
           <w:color w:val="1F4E8C"/>
           <w:sz w:val="19"/>
         </w:rPr>
+        <w:t>check:news</w:t>
+      </w:r>
+      <w:r>
+        <w:t>, link check, typecheck), and its health tile is green.</w:t>
       </w:r>
     </w:p>
     <w:p>
+      <w:pPr>
+        <w:pStyle w:val="Heading1"/>
+      </w:pPr>
       <w:r>
-        <w:t>`## 6. Rollout order</w:t>
+        <w:t>7. Decisions needed from you</w:t>
       </w:r>
     </w:p>
     <w:p>
-      <w:r>
-        <w:rPr>
-          <w:rFonts w:ascii="Consolas" w:hAnsi="Consolas"/>
-          <w:color w:val="1F4E8C"/>
-          <w:sz w:val="19"/>
-        </w:rPr>
-      </w:r>
-    </w:p>
-    <w:p>
-      <w:r>
-        <w:t>`| Phase | What | Result | Owner |</w:t>
-      </w:r>
-    </w:p>
-    <w:p>
-      <w:r>
-        <w:t>`|---|---|---|---|</w:t>
-      </w:r>
-    </w:p>
-    <w:p>
-      <w:r>
-        <w:t xml:space="preserve">`| </w:t>
-      </w:r>
-      <w:r>
-        <w:rPr>
-          <w:b/>
-        </w:rPr>
-        <w:t>0. Stop the read waste</w:t>
-      </w:r>
-      <w:r>
-        <w:t xml:space="preserve"> | Batched daily deploy, builds reuse the snapshot. Weekly database backup. | No more D1 read-limit surprises; automatic backups. | Me |</w:t>
-      </w:r>
-    </w:p>
-    <w:p>
-      <w:r>
-        <w:t xml:space="preserve">`| </w:t>
-      </w:r>
-      <w:r>
-        <w:rPr>
-          <w:b/>
-        </w:rPr>
-        <w:t>1. Visibility</w:t>
-      </w:r>
-      <w:r>
-        <w:t xml:space="preserve"> | Routine health tile, failure emails, data health report. | You can see what each routine is doing. | Me |</w:t>
-      </w:r>
-    </w:p>
-    <w:p>
-      <w:r>
-        <w:t xml:space="preserve">`| </w:t>
-      </w:r>
-      <w:r>
-        <w:rPr>
-          <w:b/>
-        </w:rPr>
-        <w:t>2. Consolidate</w:t>
-      </w:r>
-      <w:r>
-        <w:t xml:space="preserve"> | One shared runbook per type + city config; shared state schema; snapshot slices. | About 2,500 lines of near-copies become one runbook; smaller reads per run. | Me |</w:t>
-      </w:r>
-    </w:p>
-    <w:p>
-      <w:r>
-        <w:t xml:space="preserve">`| </w:t>
-      </w:r>
-      <w:r>
-        <w:rPr>
-          <w:b/>
-        </w:rPr>
-        <w:t>3. Move mechanical work to scripts</w:t>
-      </w:r>
-      <w:r>
-        <w:t xml:space="preserve"> | Dedupe, validation, link and website checks, SQL checks, tidy-up. | Agent work shrinks to judgement only. | Me |</w:t>
-      </w:r>
-    </w:p>
-    <w:p>
-      <w:r>
-        <w:t xml:space="preserve">`| </w:t>
-      </w:r>
-      <w:r>
-        <w:rPr>
-          <w:b/>
-        </w:rPr>
-        <w:t>4. Add the new routines</w:t>
-      </w:r>
-      <w:r>
-        <w:t xml:space="preserve"> | Business emails and websites, tourism refresh, expired content, boundaries, production checks, guides. | The gaps in section 2 are closed. | Me |</w:t>
-      </w:r>
-    </w:p>
-    <w:p>
-      <w:r>
-        <w:t xml:space="preserve">`| </w:t>
-      </w:r>
-      <w:r>
-        <w:rPr>
-          <w:b/>
-        </w:rPr>
-        <w:t>5. Turn on schedules</w:t>
-      </w:r>
-      <w:r>
-        <w:t xml:space="preserve"> | Create the scheduled cloud agents for each city from the new runbooks; switch off the old ones only after two clean runs each. | Rewritten routines are live. | You (accounts), Me (runbooks) |</w:t>
-      </w:r>
-    </w:p>
-    <w:p>
-      <w:r>
-        <w:rPr>
-          <w:rFonts w:ascii="Consolas" w:hAnsi="Consolas"/>
-          <w:color w:val="1F4E8C"/>
-          <w:sz w:val="19"/>
-        </w:rPr>
-      </w:r>
-    </w:p>
-    <w:p>
-      <w:r>
-        <w:rPr>
-          <w:rFonts w:ascii="Consolas" w:hAnsi="Consolas"/>
-          <w:color w:val="1F4E8C"/>
-          <w:sz w:val="19"/>
-        </w:rPr>
-        <w:t>Acceptance for each phase: the routine runs cleanly twice in a row on the dev branch, its output passes the existing checks (\</w:t>
-      </w:r>
-      <w:r>
-        <w:t>check:news\`, link check, typecheck), and its health tile is green.</w:t>
-      </w:r>
-    </w:p>
-    <w:p>
-      <w:r>
-        <w:rPr>
-          <w:rFonts w:ascii="Consolas" w:hAnsi="Consolas"/>
-          <w:color w:val="1F4E8C"/>
-          <w:sz w:val="19"/>
-        </w:rPr>
-      </w:r>
-    </w:p>
-    <w:p>
-      <w:r>
-        <w:t>`## 7. Decisions needed from you</w:t>
-      </w:r>
-    </w:p>
-    <w:p>
-      <w:r>
-        <w:rPr>
-          <w:rFonts w:ascii="Consolas" w:hAnsi="Consolas"/>
-          <w:color w:val="1F4E8C"/>
-          <w:sz w:val="19"/>
-        </w:rPr>
-      </w:r>
-    </w:p>
-    <w:p>
-      <w:r>
-        <w:t xml:space="preserve">`1. </w:t>
-      </w:r>
+      <w:pPr>
+        <w:pStyle w:val="ListNumber"/>
+      </w:pPr>
       <w:r>
         <w:rPr>
           <w:b/>
@@ -1098,9 +2405,9 @@
       </w:r>
     </w:p>
     <w:p>
-      <w:r>
-        <w:t xml:space="preserve">`2. </w:t>
-      </w:r>
+      <w:pPr>
+        <w:pStyle w:val="ListNumber"/>
+      </w:pPr>
       <w:r>
         <w:rPr>
           <w:b/>
@@ -1112,9 +2419,9 @@
       </w:r>
     </w:p>
     <w:p>
-      <w:r>
-        <w:t xml:space="preserve">`3. </w:t>
-      </w:r>
+      <w:pPr>
+        <w:pStyle w:val="ListNumber"/>
+      </w:pPr>
       <w:r>
         <w:rPr>
           <w:b/>
@@ -1126,9 +2433,9 @@
       </w:r>
     </w:p>
     <w:p>
-      <w:r>
-        <w:t xml:space="preserve">`4. </w:t>
-      </w:r>
+      <w:pPr>
+        <w:pStyle w:val="ListNumber"/>
+      </w:pPr>
       <w:r>
         <w:rPr>
           <w:b/>
@@ -1140,32 +2447,17 @@
       </w:r>
     </w:p>
     <w:p>
+      <w:pPr>
+        <w:pStyle w:val="Heading1"/>
+      </w:pPr>
       <w:r>
-        <w:rPr>
-          <w:rFonts w:ascii="Consolas" w:hAnsi="Consolas"/>
-          <w:color w:val="1F4E8C"/>
-          <w:sz w:val="19"/>
-        </w:rPr>
+        <w:t>8. Risks</w:t>
       </w:r>
     </w:p>
     <w:p>
-      <w:r>
-        <w:t>`## 8. Risks</w:t>
-      </w:r>
-    </w:p>
-    <w:p>
-      <w:r>
-        <w:rPr>
-          <w:rFonts w:ascii="Consolas" w:hAnsi="Consolas"/>
-          <w:color w:val="1F4E8C"/>
-          <w:sz w:val="19"/>
-        </w:rPr>
-      </w:r>
-    </w:p>
-    <w:p>
-      <w:r>
-        <w:t xml:space="preserve">`- </w:t>
-      </w:r>
+      <w:pPr>
+        <w:pStyle w:val="ListBullet"/>
+      </w:pPr>
       <w:r>
         <w:rPr>
           <w:b/>
@@ -1177,9 +2469,9 @@
       </w:r>
     </w:p>
     <w:p>
-      <w:r>
-        <w:t xml:space="preserve">`- </w:t>
-      </w:r>
+      <w:pPr>
+        <w:pStyle w:val="ListBullet"/>
+      </w:pPr>
       <w:r>
         <w:rPr>
           <w:b/>
@@ -1191,9 +2483,9 @@
       </w:r>
     </w:p>
     <w:p>
-      <w:r>
-        <w:t xml:space="preserve">`- </w:t>
-      </w:r>
+      <w:pPr>
+        <w:pStyle w:val="ListBullet"/>
+      </w:pPr>
       <w:r>
         <w:rPr>
           <w:b/>

</xml_diff>

<commit_message>
Split the business routine's five jobs into four separate routines in the routines plan
Co-Authored-By: Claude Sonnet 5 <noreply@anthropic.com>
</commit_message>
<xml_diff>
--- a/ROUTINES-PLAN.docx
+++ b/ROUTINES-PLAN.docx
@@ -1016,13 +1016,13 @@
                 <w:b/>
                 <w:sz w:val="19"/>
               </w:rPr>
-              <w:t>Business discovery</w:t>
+              <w:t>1. Business discovery</w:t>
             </w:r>
             <w:r>
               <w:rPr>
                 <w:sz w:val="19"/>
               </w:rPr>
-              <w:t xml:space="preserve"> (jobs 1 and 2)</w:t>
+              <w:t xml:space="preserve"> (job 1)</w:t>
             </w:r>
           </w:p>
         </w:tc>
@@ -1036,7 +1036,7 @@
               <w:rPr>
                 <w:sz w:val="19"/>
               </w:rPr>
-              <w:t>One shared runbook + city config. A script picks the next suburbs and pre-computes the list of known businesses for just those suburbs (phone and address dedupe done by script, including neighbouring suburbs). Agent searches and verifies only. Cadence adapts: hourly while a city has unfinished suburbs, then weekly.</w:t>
+              <w:t>Own routine. A script picks the next suburbs and pre-computes the known businesses for just those suburbs (phone and address dedupe done by script, including neighbouring suburbs). Agent searches and verifies only. Runs hourly while a city has unfinished suburbs, then weekly.</w:t>
             </w:r>
           </w:p>
         </w:tc>
@@ -1053,13 +1053,13 @@
                 <w:b/>
                 <w:sz w:val="19"/>
               </w:rPr>
-              <w:t>Shopping centre sweep</w:t>
+              <w:t>2. Shopping centres</w:t>
             </w:r>
             <w:r>
               <w:rPr>
                 <w:sz w:val="19"/>
               </w:rPr>
-              <w:t xml:space="preserve"> (job 3, new-mall discovery)</w:t>
+              <w:t xml:space="preserve"> (jobs 2 and 3 plus new-mall discovery)</w:t>
             </w:r>
           </w:p>
         </w:tc>
@@ -1073,7 +1073,7 @@
               <w:rPr>
                 <w:sz w:val="19"/>
               </w:rPr>
-              <w:t>Its own weekly routine instead of a job inside the hourly one. New-mall discovery monthly.</w:t>
+              <w:t>Own routine, one centre per run: read that centre's own website, link or unlink tenants, and add tenants that are new businesses. Daily until every centre has been swept once, then weekly. New-mall discovery monthly. Jobs 2 and 3 share the same centre list and state, so they belong together.</w:t>
             </w:r>
           </w:p>
         </w:tc>
@@ -1090,7 +1090,7 @@
                 <w:b/>
                 <w:sz w:val="19"/>
               </w:rPr>
-              <w:t>Description and hours enrichment</w:t>
+              <w:t>3. Description and hours enrichment</w:t>
             </w:r>
             <w:r>
               <w:rPr>
@@ -1110,7 +1110,21 @@
               <w:rPr>
                 <w:sz w:val="19"/>
               </w:rPr>
-              <w:t>Its own daily batch routine. Script hands the agent the next batch of businesses that still lack enrichment. Also fills business emails (see 4.2).</w:t>
+              <w:t xml:space="preserve">Own routine, daily batch. A script hands the agent the next batch of businesses that still lack enrichment (guarded by </w:t>
+            </w:r>
+            <w:r>
+              <w:rPr>
+                <w:rFonts w:ascii="Consolas" w:hAnsi="Consolas"/>
+                <w:color w:val="1F4E8C"/>
+                <w:sz w:val="17"/>
+              </w:rPr>
+              <w:t>description_enriched_at IS NULL</w:t>
+            </w:r>
+            <w:r>
+              <w:rPr>
+                <w:sz w:val="19"/>
+              </w:rPr>
+              <w:t>). Also picks up business emails (see 4.2). Runs after discovery, never at the same time.</w:t>
             </w:r>
           </w:p>
         </w:tc>
@@ -1127,7 +1141,7 @@
                 <w:b/>
                 <w:sz w:val="19"/>
               </w:rPr>
-              <w:t>Closed-business check</w:t>
+              <w:t>4. Closed-business check</w:t>
             </w:r>
             <w:r>
               <w:rPr>
@@ -1147,7 +1161,7 @@
               <w:rPr>
                 <w:sz w:val="19"/>
               </w:rPr>
-              <w:t>Weekly, script-first: check the business's website and phone status; the agent only decides the unclear cases. Never deletes, only hides (as today).</w:t>
+              <w:t>Own routine, weekly. Script-first: check the business's website and phone status; the agent only decides the unclear cases. Never deletes, only hides (as today).</w:t>
             </w:r>
           </w:p>
         </w:tc>
@@ -1306,6 +1320,142 @@
       </w:tr>
     </w:tbl>
     <w:p/>
+    <w:p>
+      <w:r>
+        <w:rPr>
+          <w:b/>
+        </w:rPr>
+        <w:t>Why splitting works, and how the pieces stay out of each other's way</w:t>
+      </w:r>
+    </w:p>
+    <w:p>
+      <w:pPr>
+        <w:pStyle w:val="ListBullet"/>
+      </w:pPr>
+      <w:r>
+        <w:t xml:space="preserve">Each routine has its own schedule, its own small runbook and its own state file (for example </w:t>
+      </w:r>
+      <w:r>
+        <w:rPr>
+          <w:rFonts w:ascii="Consolas" w:hAnsi="Consolas"/>
+          <w:color w:val="1F4E8C"/>
+          <w:sz w:val="19"/>
+        </w:rPr>
+        <w:t>discovery-state.json</w:t>
+      </w:r>
+      <w:r>
+        <w:t xml:space="preserve">, </w:t>
+      </w:r>
+      <w:r>
+        <w:rPr>
+          <w:rFonts w:ascii="Consolas" w:hAnsi="Consolas"/>
+          <w:color w:val="1F4E8C"/>
+          <w:sz w:val="19"/>
+        </w:rPr>
+        <w:t>centres-state.json</w:t>
+      </w:r>
+      <w:r>
+        <w:t xml:space="preserve">), instead of one shared </w:t>
+      </w:r>
+      <w:r>
+        <w:rPr>
+          <w:rFonts w:ascii="Consolas" w:hAnsi="Consolas"/>
+          <w:color w:val="1F4E8C"/>
+          <w:sz w:val="19"/>
+        </w:rPr>
+        <w:t>routine-state.json</w:t>
+      </w:r>
+      <w:r>
+        <w:t xml:space="preserve"> that every job edits. That avoids merge conflicts when two routines commit close together.</w:t>
+      </w:r>
+    </w:p>
+    <w:p>
+      <w:pPr>
+        <w:pStyle w:val="ListBullet"/>
+      </w:pPr>
+      <w:r>
+        <w:t xml:space="preserve">Writes stay narrow and guarded, exactly as the current runbook already requires: discovery only inserts new businesses; the centre routine only changes </w:t>
+      </w:r>
+      <w:r>
+        <w:rPr>
+          <w:rFonts w:ascii="Consolas" w:hAnsi="Consolas"/>
+          <w:color w:val="1F4E8C"/>
+          <w:sz w:val="19"/>
+        </w:rPr>
+        <w:t>shopping_center_id</w:t>
+      </w:r>
+      <w:r>
+        <w:t xml:space="preserve">; enrichment only changes </w:t>
+      </w:r>
+      <w:r>
+        <w:rPr>
+          <w:rFonts w:ascii="Consolas" w:hAnsi="Consolas"/>
+          <w:color w:val="1F4E8C"/>
+          <w:sz w:val="19"/>
+        </w:rPr>
+        <w:t>description</w:t>
+      </w:r>
+      <w:r>
+        <w:t xml:space="preserve">, </w:t>
+      </w:r>
+      <w:r>
+        <w:rPr>
+          <w:rFonts w:ascii="Consolas" w:hAnsi="Consolas"/>
+          <w:color w:val="1F4E8C"/>
+          <w:sz w:val="19"/>
+        </w:rPr>
+        <w:t>hours</w:t>
+      </w:r>
+      <w:r>
+        <w:t xml:space="preserve"> and </w:t>
+      </w:r>
+      <w:r>
+        <w:rPr>
+          <w:rFonts w:ascii="Consolas" w:hAnsi="Consolas"/>
+          <w:color w:val="1F4E8C"/>
+          <w:sz w:val="19"/>
+        </w:rPr>
+        <w:t>description_enriched_at</w:t>
+      </w:r>
+      <w:r>
+        <w:t xml:space="preserve"> once per business; the closed check only sets </w:t>
+      </w:r>
+      <w:r>
+        <w:rPr>
+          <w:rFonts w:ascii="Consolas" w:hAnsi="Consolas"/>
+          <w:color w:val="1F4E8C"/>
+          <w:sz w:val="19"/>
+        </w:rPr>
+        <w:t>closed_at</w:t>
+      </w:r>
+      <w:r>
+        <w:t xml:space="preserve"> once.</w:t>
+      </w:r>
+    </w:p>
+    <w:p>
+      <w:pPr>
+        <w:pStyle w:val="ListBullet"/>
+      </w:pPr>
+      <w:r>
+        <w:t>Ordering rule: enrichment and the closed check work on businesses that already exist, so they are scheduled to start after the discovery run for that city, not at the same minute.</w:t>
+      </w:r>
+    </w:p>
+    <w:p>
+      <w:pPr>
+        <w:pStyle w:val="ListBullet"/>
+      </w:pPr>
+      <w:r>
+        <w:t>Each routine still uses one shared runbook for all three cities plus a city config, so this is four runbooks in total, not twelve.</w:t>
+      </w:r>
+    </w:p>
+    <w:p>
+      <w:pPr>
+        <w:pStyle w:val="ListBullet"/>
+      </w:pPr>
+      <w:r>
+        <w:t>Jobs 2 and 3 are merged into one routine on purpose (same centre list and state). If you would rather have five, they can be split further, at the cost of loading the centre list twice.</w:t>
+      </w:r>
+    </w:p>
     <w:p>
       <w:pPr>
         <w:pStyle w:val="Heading2"/>

</xml_diff>